<commit_message>
agregando informe Vision completo version 1 en word y md
</commit_message>
<xml_diff>
--- a/FD01-EPIS-Informe de Factibilidad de Proyecto .docx
+++ b/FD01-EPIS-Informe de Factibilidad de Proyecto .docx
@@ -226,6 +226,7 @@
         </w:rPr>
       </w:pPr>
       <w:bookmarkStart w:id="1" w:name="_heading=h.9h5cyy6db2hs" w:colFirst="0" w:colLast="0"/>
+      <w:bookmarkStart w:id="2" w:name="_Hlk228222087"/>
       <w:bookmarkEnd w:id="1"/>
       <w:r>
         <w:rPr>
@@ -238,6 +239,7 @@
         </w:rPr>
         <w:t xml:space="preserve"> Proyecto “</w:t>
       </w:r>
+      <w:proofErr w:type="spellStart"/>
       <w:r>
         <w:rPr>
           <w:rFonts w:ascii="Times New Roman" w:eastAsia="Arial" w:hAnsi="Times New Roman" w:cs="Times New Roman"/>
@@ -246,7 +248,18 @@
           <w:sz w:val="32"/>
           <w:szCs w:val="32"/>
         </w:rPr>
-        <w:t xml:space="preserve">Dashboard de análisis electoral y evaluación de planes de gobierno </w:t>
+        <w:t>Dashboard</w:t>
+      </w:r>
+      <w:proofErr w:type="spellEnd"/>
+      <w:r>
+        <w:rPr>
+          <w:rFonts w:ascii="Times New Roman" w:eastAsia="Arial" w:hAnsi="Times New Roman" w:cs="Times New Roman"/>
+          <w:b/>
+          <w:bCs/>
+          <w:sz w:val="32"/>
+          <w:szCs w:val="32"/>
+        </w:rPr>
+        <w:t xml:space="preserve"> de análisis electoral y evaluación de planes de gobierno </w:t>
       </w:r>
       <w:r>
         <w:rPr>
@@ -378,23 +391,25 @@
           <w:sz w:val="32"/>
           <w:szCs w:val="32"/>
         </w:rPr>
-        <w:t xml:space="preserve">Docente: Mag. </w:t>
-      </w:r>
+        <w:t xml:space="preserve">Docente: </w:t>
+      </w:r>
+      <w:proofErr w:type="spellStart"/>
       <w:r>
         <w:rPr>
           <w:rFonts w:ascii="Times New Roman" w:eastAsia="Arial" w:hAnsi="Times New Roman" w:cs="Times New Roman"/>
           <w:sz w:val="32"/>
           <w:szCs w:val="32"/>
         </w:rPr>
-        <w:t>Patrick</w:t>
-      </w:r>
+        <w:t>Mag</w:t>
+      </w:r>
+      <w:proofErr w:type="spellEnd"/>
       <w:r>
         <w:rPr>
           <w:rFonts w:ascii="Times New Roman" w:eastAsia="Arial" w:hAnsi="Times New Roman" w:cs="Times New Roman"/>
           <w:sz w:val="32"/>
           <w:szCs w:val="32"/>
         </w:rPr>
-        <w:t xml:space="preserve"> </w:t>
+        <w:t xml:space="preserve">. </w:t>
       </w:r>
       <w:r>
         <w:rPr>
@@ -402,7 +417,33 @@
           <w:sz w:val="32"/>
           <w:szCs w:val="32"/>
         </w:rPr>
-        <w:t>Jose Cuadros Quiroga</w:t>
+        <w:t>Patrick</w:t>
+      </w:r>
+      <w:r>
+        <w:rPr>
+          <w:rFonts w:ascii="Times New Roman" w:eastAsia="Arial" w:hAnsi="Times New Roman" w:cs="Times New Roman"/>
+          <w:sz w:val="32"/>
+          <w:szCs w:val="32"/>
+        </w:rPr>
+        <w:t xml:space="preserve"> </w:t>
+      </w:r>
+      <w:proofErr w:type="spellStart"/>
+      <w:r>
+        <w:rPr>
+          <w:rFonts w:ascii="Times New Roman" w:eastAsia="Arial" w:hAnsi="Times New Roman" w:cs="Times New Roman"/>
+          <w:sz w:val="32"/>
+          <w:szCs w:val="32"/>
+        </w:rPr>
+        <w:t>Jose</w:t>
+      </w:r>
+      <w:proofErr w:type="spellEnd"/>
+      <w:r>
+        <w:rPr>
+          <w:rFonts w:ascii="Times New Roman" w:eastAsia="Arial" w:hAnsi="Times New Roman" w:cs="Times New Roman"/>
+          <w:sz w:val="32"/>
+          <w:szCs w:val="32"/>
+        </w:rPr>
+        <w:t xml:space="preserve"> Cuadros Quiroga</w:t>
       </w:r>
     </w:p>
     <w:p>
@@ -478,8 +519,8 @@
           <w:szCs w:val="28"/>
         </w:rPr>
       </w:pPr>
-      <w:bookmarkStart w:id="2" w:name="_heading=h.nnfm59ukuacf" w:colFirst="0" w:colLast="0"/>
-      <w:bookmarkEnd w:id="2"/>
+      <w:bookmarkStart w:id="3" w:name="_heading=h.nnfm59ukuacf" w:colFirst="0" w:colLast="0"/>
+      <w:bookmarkEnd w:id="3"/>
       <w:r>
         <w:rPr>
           <w:rFonts w:ascii="Times New Roman" w:eastAsia="Arial" w:hAnsi="Times New Roman" w:cs="Times New Roman"/>
@@ -488,7 +529,29 @@
           <w:sz w:val="28"/>
           <w:szCs w:val="28"/>
         </w:rPr>
-        <w:t>Chura Ticona, Mary Luz                    (2019065163)</w:t>
+        <w:t xml:space="preserve">Chura Ticona, Mary Luz                 </w:t>
+      </w:r>
+      <w:proofErr w:type="gramStart"/>
+      <w:r>
+        <w:rPr>
+          <w:rFonts w:ascii="Times New Roman" w:eastAsia="Arial" w:hAnsi="Times New Roman" w:cs="Times New Roman"/>
+          <w:b/>
+          <w:bCs/>
+          <w:sz w:val="28"/>
+          <w:szCs w:val="28"/>
+        </w:rPr>
+        <w:t xml:space="preserve">   (</w:t>
+      </w:r>
+      <w:proofErr w:type="gramEnd"/>
+      <w:r>
+        <w:rPr>
+          <w:rFonts w:ascii="Times New Roman" w:eastAsia="Arial" w:hAnsi="Times New Roman" w:cs="Times New Roman"/>
+          <w:b/>
+          <w:bCs/>
+          <w:sz w:val="28"/>
+          <w:szCs w:val="28"/>
+        </w:rPr>
+        <w:t>2019065163)</w:t>
       </w:r>
     </w:p>
     <w:p>
@@ -699,6 +762,7 @@
         </w:rPr>
       </w:pPr>
     </w:p>
+    <w:bookmarkEnd w:id="2"/>
     <w:p>
       <w:pPr>
         <w:spacing w:after="200" w:line="276" w:lineRule="auto"/>
@@ -864,12 +928,21 @@
           <w:color w:val="000000"/>
         </w:rPr>
       </w:pPr>
+      <w:proofErr w:type="spellStart"/>
       <w:r>
         <w:rPr>
           <w:rFonts w:ascii="Times New Roman" w:eastAsia="Times New Roman" w:hAnsi="Times New Roman" w:cs="Times New Roman"/>
           <w:color w:val="000000"/>
         </w:rPr>
-        <w:t>Dashboard de análisis electoral y evaluación de planes de gobierno – Perú 2021</w:t>
+        <w:t>Dashboard</w:t>
+      </w:r>
+      <w:proofErr w:type="spellEnd"/>
+      <w:r>
+        <w:rPr>
+          <w:rFonts w:ascii="Times New Roman" w:eastAsia="Times New Roman" w:hAnsi="Times New Roman" w:cs="Times New Roman"/>
+          <w:color w:val="000000"/>
+        </w:rPr>
+        <w:t xml:space="preserve"> de análisis electoral y evaluación de planes de gobierno – Perú 2021</w:t>
       </w:r>
     </w:p>
     <w:p>
@@ -1396,8 +1469,18 @@
                 <w:sz w:val="14"/>
                 <w:szCs w:val="14"/>
               </w:rPr>
-              <w:t>JZP, MCT,MAC</w:t>
-            </w:r>
+              <w:t xml:space="preserve">JZP, </w:t>
+            </w:r>
+            <w:proofErr w:type="gramStart"/>
+            <w:r>
+              <w:rPr>
+                <w:rFonts w:ascii="Times New Roman" w:hAnsi="Times New Roman" w:cs="Times New Roman"/>
+                <w:sz w:val="14"/>
+                <w:szCs w:val="14"/>
+              </w:rPr>
+              <w:t>MCT,MAC</w:t>
+            </w:r>
+            <w:proofErr w:type="gramEnd"/>
           </w:p>
         </w:tc>
         <w:tc>
@@ -1521,8 +1604,8 @@
           <w:u w:val="single"/>
         </w:rPr>
       </w:pPr>
-      <w:bookmarkStart w:id="3" w:name="_heading=h.3tx029ewgk01" w:colFirst="0" w:colLast="0"/>
-      <w:bookmarkEnd w:id="3"/>
+      <w:bookmarkStart w:id="4" w:name="_heading=h.3tx029ewgk01" w:colFirst="0" w:colLast="0"/>
+      <w:bookmarkEnd w:id="4"/>
     </w:p>
     <w:p>
       <w:pPr>
@@ -2020,15 +2103,25 @@
           <w:szCs w:val="24"/>
         </w:rPr>
       </w:pPr>
-      <w:bookmarkStart w:id="4" w:name="_heading=h.3znysh7" w:colFirst="0" w:colLast="0"/>
-      <w:bookmarkEnd w:id="4"/>
-      <w:r>
-        <w:rPr>
-          <w:rFonts w:ascii="Times New Roman" w:hAnsi="Times New Roman" w:cs="Times New Roman"/>
-          <w:sz w:val="24"/>
-          <w:szCs w:val="24"/>
-        </w:rPr>
-        <w:t>Dashboard de análisis electoral y evaluación de planes de gobierno – Perú 2021</w:t>
+      <w:bookmarkStart w:id="5" w:name="_heading=h.3znysh7" w:colFirst="0" w:colLast="0"/>
+      <w:bookmarkEnd w:id="5"/>
+      <w:proofErr w:type="spellStart"/>
+      <w:r>
+        <w:rPr>
+          <w:rFonts w:ascii="Times New Roman" w:hAnsi="Times New Roman" w:cs="Times New Roman"/>
+          <w:sz w:val="24"/>
+          <w:szCs w:val="24"/>
+        </w:rPr>
+        <w:t>Dashboard</w:t>
+      </w:r>
+      <w:proofErr w:type="spellEnd"/>
+      <w:r>
+        <w:rPr>
+          <w:rFonts w:ascii="Times New Roman" w:hAnsi="Times New Roman" w:cs="Times New Roman"/>
+          <w:sz w:val="24"/>
+          <w:szCs w:val="24"/>
+        </w:rPr>
+        <w:t xml:space="preserve"> de análisis electoral y evaluación de planes de gobierno – Perú 2021</w:t>
       </w:r>
     </w:p>
     <w:p>
@@ -2330,7 +2423,25 @@
           <w:sz w:val="24"/>
           <w:szCs w:val="24"/>
         </w:rPr>
-        <w:t>El presente proyecto consiste en el desarrollo de un dashboard interactivo de análisis electoral y evaluación de planes de gobierno, basado en las Elecciones Generales del Perú 2021. La solución busca integrar, organizar y visualizar información electoral relevante, permitiendo analizar resultados, comparar candidatos presidenciales y evaluar sus principales propuestas de gobierno.</w:t>
+        <w:t xml:space="preserve">El presente proyecto consiste en el desarrollo de un </w:t>
+      </w:r>
+      <w:proofErr w:type="spellStart"/>
+      <w:r>
+        <w:rPr>
+          <w:rFonts w:ascii="Times New Roman" w:hAnsi="Times New Roman" w:cs="Times New Roman"/>
+          <w:sz w:val="24"/>
+          <w:szCs w:val="24"/>
+        </w:rPr>
+        <w:t>dashboard</w:t>
+      </w:r>
+      <w:proofErr w:type="spellEnd"/>
+      <w:r>
+        <w:rPr>
+          <w:rFonts w:ascii="Times New Roman" w:hAnsi="Times New Roman" w:cs="Times New Roman"/>
+          <w:sz w:val="24"/>
+          <w:szCs w:val="24"/>
+        </w:rPr>
+        <w:t xml:space="preserve"> interactivo de análisis electoral y evaluación de planes de gobierno, basado en las Elecciones Generales del Perú 2021. La solución busca integrar, organizar y visualizar información electoral relevante, permitiendo analizar resultados, comparar candidatos presidenciales y evaluar sus principales propuestas de gobierno.</w:t>
       </w:r>
     </w:p>
     <w:p>
@@ -2362,7 +2473,25 @@
           <w:sz w:val="24"/>
           <w:szCs w:val="24"/>
         </w:rPr>
-        <w:t>El dashboard permitirá representar datos como votos obtenidos por candidato, distribución porcentual de resultados, comparación de propuestas por sectores y análisis de viabilidad según criterios como impacto, costo estimado y alineación con necesidades sociales. De esta manera, se busca transformar información electoral dispersa en una herramienta visual, clara y útil para la toma de decisiones.</w:t>
+        <w:t xml:space="preserve">El </w:t>
+      </w:r>
+      <w:proofErr w:type="spellStart"/>
+      <w:r>
+        <w:rPr>
+          <w:rFonts w:ascii="Times New Roman" w:hAnsi="Times New Roman" w:cs="Times New Roman"/>
+          <w:sz w:val="24"/>
+          <w:szCs w:val="24"/>
+        </w:rPr>
+        <w:t>dashboard</w:t>
+      </w:r>
+      <w:proofErr w:type="spellEnd"/>
+      <w:r>
+        <w:rPr>
+          <w:rFonts w:ascii="Times New Roman" w:hAnsi="Times New Roman" w:cs="Times New Roman"/>
+          <w:sz w:val="24"/>
+          <w:szCs w:val="24"/>
+        </w:rPr>
+        <w:t xml:space="preserve"> permitirá representar datos como votos obtenidos por candidato, distribución porcentual de resultados, comparación de propuestas por sectores y análisis de viabilidad según criterios como impacto, costo estimado y alineación con necesidades sociales. De esta manera, se busca transformar información electoral dispersa en una herramienta visual, clara y útil para la toma de decisiones.</w:t>
       </w:r>
     </w:p>
     <w:p>
@@ -2518,7 +2647,25 @@
           <w:sz w:val="24"/>
           <w:szCs w:val="24"/>
         </w:rPr>
-        <w:t>Desarrollar un dashboard interactivo de análisis electoral y evaluación de planes de gobierno basado en las Elecciones Generales del Perú 2021, que permita visualizar resultados, comparar candidatos y analizar la viabilidad de sus propuestas mediante indicadores gráficos y métricas de evaluación.</w:t>
+        <w:t xml:space="preserve">Desarrollar un </w:t>
+      </w:r>
+      <w:proofErr w:type="spellStart"/>
+      <w:r>
+        <w:rPr>
+          <w:rFonts w:ascii="Times New Roman" w:hAnsi="Times New Roman" w:cs="Times New Roman"/>
+          <w:sz w:val="24"/>
+          <w:szCs w:val="24"/>
+        </w:rPr>
+        <w:t>dashboard</w:t>
+      </w:r>
+      <w:proofErr w:type="spellEnd"/>
+      <w:r>
+        <w:rPr>
+          <w:rFonts w:ascii="Times New Roman" w:hAnsi="Times New Roman" w:cs="Times New Roman"/>
+          <w:sz w:val="24"/>
+          <w:szCs w:val="24"/>
+        </w:rPr>
+        <w:t xml:space="preserve"> interactivo de análisis electoral y evaluación de planes de gobierno basado en las Elecciones Generales del Perú 2021, que permita visualizar resultados, comparar candidatos y analizar la viabilidad de sus propuestas mediante indicadores gráficos y métricas de evaluación.</w:t>
       </w:r>
     </w:p>
     <w:p>
@@ -2672,7 +2819,27 @@
           <w:sz w:val="24"/>
           <w:szCs w:val="24"/>
         </w:rPr>
-        <w:t>Implementar dashboards o reportes visuales que faciliten la comparación entre candidatos.</w:t>
+        <w:t xml:space="preserve">Implementar </w:t>
+      </w:r>
+      <w:proofErr w:type="spellStart"/>
+      <w:r>
+        <w:rPr>
+          <w:rFonts w:ascii="Times New Roman" w:hAnsi="Times New Roman" w:cs="Times New Roman"/>
+          <w:color w:val="000000"/>
+          <w:sz w:val="24"/>
+          <w:szCs w:val="24"/>
+        </w:rPr>
+        <w:t>dashboards</w:t>
+      </w:r>
+      <w:proofErr w:type="spellEnd"/>
+      <w:r>
+        <w:rPr>
+          <w:rFonts w:ascii="Times New Roman" w:hAnsi="Times New Roman" w:cs="Times New Roman"/>
+          <w:color w:val="000000"/>
+          <w:sz w:val="24"/>
+          <w:szCs w:val="24"/>
+        </w:rPr>
+        <w:t xml:space="preserve"> o reportes visuales que faciliten la comparación entre candidatos.</w:t>
       </w:r>
     </w:p>
     <w:p>
@@ -2800,8 +2967,8 @@
           <w:szCs w:val="24"/>
         </w:rPr>
       </w:pPr>
-      <w:bookmarkStart w:id="5" w:name="_heading=h.1f69eu7p6ih4" w:colFirst="0" w:colLast="0"/>
-      <w:bookmarkEnd w:id="5"/>
+      <w:bookmarkStart w:id="6" w:name="_heading=h.1f69eu7p6ih4" w:colFirst="0" w:colLast="0"/>
+      <w:bookmarkEnd w:id="6"/>
       <w:r>
         <w:rPr>
           <w:rFonts w:ascii="Times New Roman" w:hAnsi="Times New Roman" w:cs="Times New Roman"/>
@@ -2928,7 +3095,25 @@
           <w:sz w:val="24"/>
           <w:szCs w:val="24"/>
         </w:rPr>
-        <w:t>Limitaciones técnicas en el diseño del dashboard.</w:t>
+        <w:t xml:space="preserve">Limitaciones técnicas en el diseño del </w:t>
+      </w:r>
+      <w:proofErr w:type="spellStart"/>
+      <w:r>
+        <w:rPr>
+          <w:rFonts w:ascii="Times New Roman" w:hAnsi="Times New Roman" w:cs="Times New Roman"/>
+          <w:sz w:val="24"/>
+          <w:szCs w:val="24"/>
+        </w:rPr>
+        <w:t>dashboard</w:t>
+      </w:r>
+      <w:proofErr w:type="spellEnd"/>
+      <w:r>
+        <w:rPr>
+          <w:rFonts w:ascii="Times New Roman" w:hAnsi="Times New Roman" w:cs="Times New Roman"/>
+          <w:sz w:val="24"/>
+          <w:szCs w:val="24"/>
+        </w:rPr>
+        <w:t>.</w:t>
       </w:r>
     </w:p>
     <w:p>
@@ -3048,7 +3233,25 @@
           <w:sz w:val="24"/>
           <w:szCs w:val="24"/>
         </w:rPr>
-        <w:t>Posibles problemas al publicar el dashboard en un entorno web o repositorio público.</w:t>
+        <w:t xml:space="preserve">Posibles problemas al publicar el </w:t>
+      </w:r>
+      <w:proofErr w:type="spellStart"/>
+      <w:r>
+        <w:rPr>
+          <w:rFonts w:ascii="Times New Roman" w:hAnsi="Times New Roman" w:cs="Times New Roman"/>
+          <w:sz w:val="24"/>
+          <w:szCs w:val="24"/>
+        </w:rPr>
+        <w:t>dashboard</w:t>
+      </w:r>
+      <w:proofErr w:type="spellEnd"/>
+      <w:r>
+        <w:rPr>
+          <w:rFonts w:ascii="Times New Roman" w:hAnsi="Times New Roman" w:cs="Times New Roman"/>
+          <w:sz w:val="24"/>
+          <w:szCs w:val="24"/>
+        </w:rPr>
+        <w:t xml:space="preserve"> en un entorno web o repositorio público.</w:t>
       </w:r>
     </w:p>
     <w:p>
@@ -3239,7 +3442,25 @@
           <w:sz w:val="24"/>
           <w:szCs w:val="24"/>
         </w:rPr>
-        <w:t>En este contexto, se propone desarrollar un dashboard de análisis electoral y evaluación de planes de gobierno basado en las Elecciones Generales del Perú 2021, con el objetivo de facilitar la interpretación de datos, fortalecer la transparencia informativa y promover una toma de decisiones más informada.</w:t>
+        <w:t xml:space="preserve">En este contexto, se propone desarrollar un </w:t>
+      </w:r>
+      <w:proofErr w:type="spellStart"/>
+      <w:r>
+        <w:rPr>
+          <w:rFonts w:ascii="Times New Roman" w:hAnsi="Times New Roman" w:cs="Times New Roman"/>
+          <w:sz w:val="24"/>
+          <w:szCs w:val="24"/>
+        </w:rPr>
+        <w:t>dashboard</w:t>
+      </w:r>
+      <w:proofErr w:type="spellEnd"/>
+      <w:r>
+        <w:rPr>
+          <w:rFonts w:ascii="Times New Roman" w:hAnsi="Times New Roman" w:cs="Times New Roman"/>
+          <w:sz w:val="24"/>
+          <w:szCs w:val="24"/>
+        </w:rPr>
+        <w:t xml:space="preserve"> de análisis electoral y evaluación de planes de gobierno basado en las Elecciones Generales del Perú 2021, con el objetivo de facilitar la interpretación de datos, fortalecer la transparencia informativa y promover una toma de decisiones más informada.</w:t>
       </w:r>
     </w:p>
     <w:p>
@@ -3314,7 +3535,21 @@
         <w:rPr>
           <w:rFonts w:ascii="Times New Roman" w:hAnsi="Times New Roman" w:cs="Times New Roman"/>
         </w:rPr>
-        <w:t>Con respecto a los recursos tecnológicos requeridos para el desarrollo del proyecto de dashboard de análisis electoral, se consideran los siguientes componentes de hardware y software necesarios para la recopilación, procesamiento y visualización de datos.</w:t>
+        <w:t xml:space="preserve">Con respecto a los recursos tecnológicos requeridos para el desarrollo del proyecto de </w:t>
+      </w:r>
+      <w:proofErr w:type="spellStart"/>
+      <w:r>
+        <w:rPr>
+          <w:rFonts w:ascii="Times New Roman" w:hAnsi="Times New Roman" w:cs="Times New Roman"/>
+        </w:rPr>
+        <w:t>dashboard</w:t>
+      </w:r>
+      <w:proofErr w:type="spellEnd"/>
+      <w:r>
+        <w:rPr>
+          <w:rFonts w:ascii="Times New Roman" w:hAnsi="Times New Roman" w:cs="Times New Roman"/>
+        </w:rPr>
+        <w:t xml:space="preserve"> de análisis electoral, se consideran los siguientes componentes de hardware y software necesarios para la recopilación, procesamiento y visualización de datos.</w:t>
       </w:r>
     </w:p>
     <w:p>
@@ -4122,13 +4357,41 @@
                 <w:szCs w:val="24"/>
               </w:rPr>
             </w:pPr>
-            <w:r>
-              <w:rPr>
-                <w:rFonts w:ascii="Times New Roman" w:hAnsi="Times New Roman" w:cs="Times New Roman"/>
-                <w:sz w:val="24"/>
-                <w:szCs w:val="24"/>
-              </w:rPr>
-              <w:t>Power BI / Tableau (herramienta de visualización)</w:t>
+            <w:proofErr w:type="spellStart"/>
+            <w:r>
+              <w:rPr>
+                <w:rFonts w:ascii="Times New Roman" w:hAnsi="Times New Roman" w:cs="Times New Roman"/>
+                <w:sz w:val="24"/>
+                <w:szCs w:val="24"/>
+              </w:rPr>
+              <w:t>Power</w:t>
+            </w:r>
+            <w:proofErr w:type="spellEnd"/>
+            <w:r>
+              <w:rPr>
+                <w:rFonts w:ascii="Times New Roman" w:hAnsi="Times New Roman" w:cs="Times New Roman"/>
+                <w:sz w:val="24"/>
+                <w:szCs w:val="24"/>
+              </w:rPr>
+              <w:t xml:space="preserve"> BI / </w:t>
+            </w:r>
+            <w:proofErr w:type="spellStart"/>
+            <w:r>
+              <w:rPr>
+                <w:rFonts w:ascii="Times New Roman" w:hAnsi="Times New Roman" w:cs="Times New Roman"/>
+                <w:sz w:val="24"/>
+                <w:szCs w:val="24"/>
+              </w:rPr>
+              <w:t>Tableau</w:t>
+            </w:r>
+            <w:proofErr w:type="spellEnd"/>
+            <w:r>
+              <w:rPr>
+                <w:rFonts w:ascii="Times New Roman" w:hAnsi="Times New Roman" w:cs="Times New Roman"/>
+                <w:sz w:val="24"/>
+                <w:szCs w:val="24"/>
+              </w:rPr>
+              <w:t xml:space="preserve"> (herramienta de visualización)</w:t>
             </w:r>
           </w:p>
           <w:p>
@@ -4278,7 +4541,21 @@
               <w:rPr>
                 <w:rFonts w:ascii="Times New Roman" w:hAnsi="Times New Roman" w:cs="Times New Roman"/>
               </w:rPr>
-              <w:t>Visual Studio Code (IDE)</w:t>
+              <w:t xml:space="preserve">Visual Studio </w:t>
+            </w:r>
+            <w:proofErr w:type="spellStart"/>
+            <w:r>
+              <w:rPr>
+                <w:rFonts w:ascii="Times New Roman" w:hAnsi="Times New Roman" w:cs="Times New Roman"/>
+              </w:rPr>
+              <w:t>Code</w:t>
+            </w:r>
+            <w:proofErr w:type="spellEnd"/>
+            <w:r>
+              <w:rPr>
+                <w:rFonts w:ascii="Times New Roman" w:hAnsi="Times New Roman" w:cs="Times New Roman"/>
+              </w:rPr>
+              <w:t xml:space="preserve"> (IDE)</w:t>
             </w:r>
           </w:p>
         </w:tc>
@@ -4485,11 +4762,19 @@
                 <w:rFonts w:ascii="Times New Roman" w:hAnsi="Times New Roman" w:cs="Times New Roman"/>
               </w:rPr>
             </w:pPr>
-            <w:r>
-              <w:rPr>
-                <w:rFonts w:ascii="Times New Roman" w:hAnsi="Times New Roman" w:cs="Times New Roman"/>
-              </w:rPr>
-              <w:t>Terraform (infraestructura como código)</w:t>
+            <w:proofErr w:type="spellStart"/>
+            <w:r>
+              <w:rPr>
+                <w:rFonts w:ascii="Times New Roman" w:hAnsi="Times New Roman" w:cs="Times New Roman"/>
+              </w:rPr>
+              <w:t>Terraform</w:t>
+            </w:r>
+            <w:proofErr w:type="spellEnd"/>
+            <w:r>
+              <w:rPr>
+                <w:rFonts w:ascii="Times New Roman" w:hAnsi="Times New Roman" w:cs="Times New Roman"/>
+              </w:rPr>
+              <w:t xml:space="preserve"> (infraestructura como código)</w:t>
             </w:r>
           </w:p>
         </w:tc>
@@ -4562,7 +4847,7 @@
               <w:tblLook w:val="04A0" w:firstRow="1" w:lastRow="0" w:firstColumn="1" w:lastColumn="0" w:noHBand="0" w:noVBand="1"/>
             </w:tblPr>
             <w:tblGrid>
-              <w:gridCol w:w="96"/>
+              <w:gridCol w:w="110"/>
             </w:tblGrid>
             <w:tr>
               <w:trPr>
@@ -4859,15 +5144,51 @@
           <w:szCs w:val="24"/>
         </w:rPr>
       </w:pPr>
-      <w:bookmarkStart w:id="6" w:name="_heading=h.ppvdd9bw2fmj" w:colFirst="0" w:colLast="0"/>
-      <w:bookmarkEnd w:id="6"/>
-      <w:r>
-        <w:rPr>
-          <w:rFonts w:ascii="Times New Roman" w:hAnsi="Times New Roman" w:cs="Times New Roman"/>
-          <w:sz w:val="24"/>
-          <w:szCs w:val="24"/>
-        </w:rPr>
-        <w:t>El proyecto de dashboard de análisis electoral es técnicamente viable, ya que se basa en el uso de herramientas ampliamente utilizadas en el análisis y visualización de datos, como Power BI, Microsoft Excel y lenguajes de programación como Python.</w:t>
+      <w:bookmarkStart w:id="7" w:name="_heading=h.ppvdd9bw2fmj" w:colFirst="0" w:colLast="0"/>
+      <w:bookmarkEnd w:id="7"/>
+      <w:r>
+        <w:rPr>
+          <w:rFonts w:ascii="Times New Roman" w:hAnsi="Times New Roman" w:cs="Times New Roman"/>
+          <w:sz w:val="24"/>
+          <w:szCs w:val="24"/>
+        </w:rPr>
+        <w:t xml:space="preserve">El proyecto de </w:t>
+      </w:r>
+      <w:proofErr w:type="spellStart"/>
+      <w:r>
+        <w:rPr>
+          <w:rFonts w:ascii="Times New Roman" w:hAnsi="Times New Roman" w:cs="Times New Roman"/>
+          <w:sz w:val="24"/>
+          <w:szCs w:val="24"/>
+        </w:rPr>
+        <w:t>dashboard</w:t>
+      </w:r>
+      <w:proofErr w:type="spellEnd"/>
+      <w:r>
+        <w:rPr>
+          <w:rFonts w:ascii="Times New Roman" w:hAnsi="Times New Roman" w:cs="Times New Roman"/>
+          <w:sz w:val="24"/>
+          <w:szCs w:val="24"/>
+        </w:rPr>
+        <w:t xml:space="preserve"> de análisis electoral es técnicamente viable, ya que se basa en el uso de herramientas ampliamente utilizadas en el análisis y visualización de datos, como </w:t>
+      </w:r>
+      <w:proofErr w:type="spellStart"/>
+      <w:r>
+        <w:rPr>
+          <w:rFonts w:ascii="Times New Roman" w:hAnsi="Times New Roman" w:cs="Times New Roman"/>
+          <w:sz w:val="24"/>
+          <w:szCs w:val="24"/>
+        </w:rPr>
+        <w:t>Power</w:t>
+      </w:r>
+      <w:proofErr w:type="spellEnd"/>
+      <w:r>
+        <w:rPr>
+          <w:rFonts w:ascii="Times New Roman" w:hAnsi="Times New Roman" w:cs="Times New Roman"/>
+          <w:sz w:val="24"/>
+          <w:szCs w:val="24"/>
+        </w:rPr>
+        <w:t xml:space="preserve"> BI, Microsoft Excel y lenguajes de programación como Python.</w:t>
       </w:r>
     </w:p>
     <w:p>
@@ -4914,7 +5235,25 @@
           <w:szCs w:val="24"/>
         </w:rPr>
         <w:lastRenderedPageBreak/>
-        <w:t>Estas tecnologías permiten la recopilación, procesamiento y representación gráfica de grandes volúmenes de información electoral de manera eficiente, facilitando la construcción de dashboards interactivos que permiten comparar candidatos, resultados y propuestas de gobierno.</w:t>
+        <w:t xml:space="preserve">Estas tecnologías permiten la recopilación, procesamiento y representación gráfica de grandes volúmenes de información electoral de manera eficiente, facilitando la construcción de </w:t>
+      </w:r>
+      <w:proofErr w:type="spellStart"/>
+      <w:r>
+        <w:rPr>
+          <w:rFonts w:ascii="Times New Roman" w:hAnsi="Times New Roman" w:cs="Times New Roman"/>
+          <w:sz w:val="24"/>
+          <w:szCs w:val="24"/>
+        </w:rPr>
+        <w:t>dashboards</w:t>
+      </w:r>
+      <w:proofErr w:type="spellEnd"/>
+      <w:r>
+        <w:rPr>
+          <w:rFonts w:ascii="Times New Roman" w:hAnsi="Times New Roman" w:cs="Times New Roman"/>
+          <w:sz w:val="24"/>
+          <w:szCs w:val="24"/>
+        </w:rPr>
+        <w:t xml:space="preserve"> interactivos que permiten comparar candidatos, resultados y propuestas de gobierno.</w:t>
       </w:r>
     </w:p>
     <w:p>
@@ -4959,7 +5298,25 @@
           <w:sz w:val="24"/>
           <w:szCs w:val="24"/>
         </w:rPr>
-        <w:t>Asimismo, el desarrollo del sistema se realizará de manera progresiva, iniciando con la recopilación y limpieza de datos provenientes de fuentes oficiales como la ONPE, seguido de la estructuración de la información y finalmente la implementación de dashboards interactivos. Este enfoque incremental permite reducir riesgos técnicos y asegurar la correcta construcción del sistema.</w:t>
+        <w:t xml:space="preserve">Asimismo, el desarrollo del sistema se realizará de manera progresiva, iniciando con la recopilación y limpieza de datos provenientes de fuentes oficiales como la ONPE, seguido de la estructuración de la información y finalmente la implementación de </w:t>
+      </w:r>
+      <w:proofErr w:type="spellStart"/>
+      <w:r>
+        <w:rPr>
+          <w:rFonts w:ascii="Times New Roman" w:hAnsi="Times New Roman" w:cs="Times New Roman"/>
+          <w:sz w:val="24"/>
+          <w:szCs w:val="24"/>
+        </w:rPr>
+        <w:t>dashboards</w:t>
+      </w:r>
+      <w:proofErr w:type="spellEnd"/>
+      <w:r>
+        <w:rPr>
+          <w:rFonts w:ascii="Times New Roman" w:hAnsi="Times New Roman" w:cs="Times New Roman"/>
+          <w:sz w:val="24"/>
+          <w:szCs w:val="24"/>
+        </w:rPr>
+        <w:t xml:space="preserve"> interactivos. Este enfoque incremental permite reducir riesgos técnicos y asegurar la correcta construcción del sistema.</w:t>
       </w:r>
     </w:p>
     <w:p>
@@ -5005,7 +5362,25 @@
           <w:sz w:val="24"/>
           <w:szCs w:val="24"/>
         </w:rPr>
-        <w:t>Desde el punto de vista de infraestructura, el proyecto puede ser desplegado utilizando servicios en la nube como AWS o Azure, mediante el uso de herramientas de infraestructura como código como Terraform, lo que permite automatizar la configuración del entorno, optimizar recursos y reducir costos operativos.</w:t>
+        <w:t xml:space="preserve">Desde el punto de vista de infraestructura, el proyecto puede ser desplegado utilizando servicios en la nube como AWS o Azure, mediante el uso de herramientas de infraestructura como código como </w:t>
+      </w:r>
+      <w:proofErr w:type="spellStart"/>
+      <w:r>
+        <w:rPr>
+          <w:rFonts w:ascii="Times New Roman" w:hAnsi="Times New Roman" w:cs="Times New Roman"/>
+          <w:sz w:val="24"/>
+          <w:szCs w:val="24"/>
+        </w:rPr>
+        <w:t>Terraform</w:t>
+      </w:r>
+      <w:proofErr w:type="spellEnd"/>
+      <w:r>
+        <w:rPr>
+          <w:rFonts w:ascii="Times New Roman" w:hAnsi="Times New Roman" w:cs="Times New Roman"/>
+          <w:sz w:val="24"/>
+          <w:szCs w:val="24"/>
+        </w:rPr>
+        <w:t>, lo que permite automatizar la configuración del entorno, optimizar recursos y reducir costos operativos.</w:t>
       </w:r>
     </w:p>
     <w:p>
@@ -5051,7 +5426,25 @@
           <w:sz w:val="24"/>
           <w:szCs w:val="24"/>
         </w:rPr>
-        <w:t>En cuanto al entorno tecnológico, el sistema es viable debido a que las herramientas utilizadas son accesibles, cuentan con documentación amplia y no requieren infraestructura compleja para su implementación. Además, los usuarios finales están familiarizados con el uso de dashboards y plataformas digitales, lo que facilita la adopción del sistema.</w:t>
+        <w:t xml:space="preserve">En cuanto al entorno tecnológico, el sistema es viable debido a que las herramientas utilizadas son accesibles, cuentan con documentación amplia y no requieren infraestructura compleja para su implementación. Además, los usuarios finales están familiarizados con el uso de </w:t>
+      </w:r>
+      <w:proofErr w:type="spellStart"/>
+      <w:r>
+        <w:rPr>
+          <w:rFonts w:ascii="Times New Roman" w:hAnsi="Times New Roman" w:cs="Times New Roman"/>
+          <w:sz w:val="24"/>
+          <w:szCs w:val="24"/>
+        </w:rPr>
+        <w:t>dashboards</w:t>
+      </w:r>
+      <w:proofErr w:type="spellEnd"/>
+      <w:r>
+        <w:rPr>
+          <w:rFonts w:ascii="Times New Roman" w:hAnsi="Times New Roman" w:cs="Times New Roman"/>
+          <w:sz w:val="24"/>
+          <w:szCs w:val="24"/>
+        </w:rPr>
+        <w:t xml:space="preserve"> y plataformas digitales, lo que facilita la adopción del sistema.</w:t>
       </w:r>
     </w:p>
     <w:p>
@@ -5193,7 +5586,25 @@
           <w:sz w:val="24"/>
           <w:szCs w:val="24"/>
         </w:rPr>
-        <w:t>El proyecto es económicamente viable, ya que no requiere una inversión elevada en infraestructura y utiliza herramientas accesibles para el desarrollo de dashboards y análisis de datos. Los costos están asociados principalmente a recursos operativos, ambiente tecnológico y personal.</w:t>
+        <w:t xml:space="preserve">El proyecto es económicamente viable, ya que no requiere una inversión elevada en infraestructura y utiliza herramientas accesibles para el desarrollo de </w:t>
+      </w:r>
+      <w:proofErr w:type="spellStart"/>
+      <w:r>
+        <w:rPr>
+          <w:rFonts w:ascii="Times New Roman" w:hAnsi="Times New Roman" w:cs="Times New Roman"/>
+          <w:sz w:val="24"/>
+          <w:szCs w:val="24"/>
+        </w:rPr>
+        <w:t>dashboards</w:t>
+      </w:r>
+      <w:proofErr w:type="spellEnd"/>
+      <w:r>
+        <w:rPr>
+          <w:rFonts w:ascii="Times New Roman" w:hAnsi="Times New Roman" w:cs="Times New Roman"/>
+          <w:sz w:val="24"/>
+          <w:szCs w:val="24"/>
+        </w:rPr>
+        <w:t xml:space="preserve"> y análisis de datos. Los costos están asociados principalmente a recursos operativos, ambiente tecnológico y personal.</w:t>
       </w:r>
     </w:p>
     <w:p>
@@ -6200,20 +6611,7 @@
                 <w:sz w:val="24"/>
                 <w:szCs w:val="24"/>
               </w:rPr>
-              <w:t>Descripción</w:t>
-            </w:r>
-            <w:r>
-              <w:rPr>
-                <w:rFonts w:ascii="Times New Roman" w:hAnsi="Times New Roman" w:cs="Times New Roman"/>
-                <w:b/>
-                <w:bCs/>
-                <w:i/>
-                <w:iCs/>
-                <w:color w:val="000000"/>
-                <w:sz w:val="24"/>
-                <w:szCs w:val="24"/>
-              </w:rPr>
-              <w:t xml:space="preserve"> </w:t>
+              <w:t xml:space="preserve">Descripción </w:t>
             </w:r>
           </w:p>
         </w:tc>
@@ -8120,7 +8518,7 @@
                 <w:sz w:val="24"/>
                 <w:szCs w:val="24"/>
               </w:rPr>
-              <w:t>Descripcion</w:t>
+              <w:t>Descripción</w:t>
             </w:r>
           </w:p>
         </w:tc>
@@ -8159,6 +8557,17 @@
               </w:rPr>
               <w:t>mes/cantida</w:t>
             </w:r>
+            <w:r>
+              <w:rPr>
+                <w:rFonts w:ascii="Times New Roman" w:hAnsi="Times New Roman" w:cs="Times New Roman"/>
+                <w:b/>
+                <w:bCs/>
+                <w:color w:val="000000"/>
+                <w:sz w:val="24"/>
+                <w:szCs w:val="24"/>
+              </w:rPr>
+              <w:t>d</w:t>
+            </w:r>
           </w:p>
         </w:tc>
         <w:tc>
@@ -8269,8 +8678,19 @@
                 <w:sz w:val="24"/>
                 <w:szCs w:val="24"/>
               </w:rPr>
-              <w:t>Desarrollador Full Stack</w:t>
-            </w:r>
+              <w:t xml:space="preserve">Desarrollador Full </w:t>
+            </w:r>
+            <w:proofErr w:type="spellStart"/>
+            <w:r>
+              <w:rPr>
+                <w:rFonts w:ascii="Times New Roman" w:hAnsi="Times New Roman" w:cs="Times New Roman"/>
+                <w:color w:val="000000"/>
+                <w:sz w:val="24"/>
+                <w:szCs w:val="24"/>
+              </w:rPr>
+              <w:t>Stack</w:t>
+            </w:r>
+            <w:proofErr w:type="spellEnd"/>
           </w:p>
         </w:tc>
         <w:tc>
@@ -9484,7 +9904,61 @@
           <w:sz w:val="24"/>
           <w:szCs w:val="24"/>
         </w:rPr>
-        <w:t>La factibilidad operativa del proyecto de dashboard de análisis electoral es alta, debido a que los usuarios objetivo cuentan con conocimientos básicos en el uso de herramientas digitales, lo que facilita la adopción del sistema. Actualmente, la mayoría de personas está familiarizada con el uso de plataformas web, dashboards interactivos y visualización de datos, lo que permite que la implementación del sistema no requiera procesos complejos de adaptación.</w:t>
+        <w:t xml:space="preserve">La factibilidad operativa del proyecto de </w:t>
+      </w:r>
+      <w:proofErr w:type="spellStart"/>
+      <w:r>
+        <w:rPr>
+          <w:rFonts w:ascii="Times New Roman" w:hAnsi="Times New Roman" w:cs="Times New Roman"/>
+          <w:sz w:val="24"/>
+          <w:szCs w:val="24"/>
+        </w:rPr>
+        <w:t>dashboard</w:t>
+      </w:r>
+      <w:proofErr w:type="spellEnd"/>
+      <w:r>
+        <w:rPr>
+          <w:rFonts w:ascii="Times New Roman" w:hAnsi="Times New Roman" w:cs="Times New Roman"/>
+          <w:sz w:val="24"/>
+          <w:szCs w:val="24"/>
+        </w:rPr>
+        <w:t xml:space="preserve"> de análisis electoral es alta, debido a que los usuarios objetivo cuentan con conocimientos básicos en el uso de herramientas digitales, lo que facilita la adopción del sistema. Actualmente, la mayoría de </w:t>
+      </w:r>
+      <w:proofErr w:type="gramStart"/>
+      <w:r>
+        <w:rPr>
+          <w:rFonts w:ascii="Times New Roman" w:hAnsi="Times New Roman" w:cs="Times New Roman"/>
+          <w:sz w:val="24"/>
+          <w:szCs w:val="24"/>
+        </w:rPr>
+        <w:t>personas</w:t>
+      </w:r>
+      <w:proofErr w:type="gramEnd"/>
+      <w:r>
+        <w:rPr>
+          <w:rFonts w:ascii="Times New Roman" w:hAnsi="Times New Roman" w:cs="Times New Roman"/>
+          <w:sz w:val="24"/>
+          <w:szCs w:val="24"/>
+        </w:rPr>
+        <w:t xml:space="preserve"> está familiarizada con el uso de plataformas web, </w:t>
+      </w:r>
+      <w:proofErr w:type="spellStart"/>
+      <w:r>
+        <w:rPr>
+          <w:rFonts w:ascii="Times New Roman" w:hAnsi="Times New Roman" w:cs="Times New Roman"/>
+          <w:sz w:val="24"/>
+          <w:szCs w:val="24"/>
+        </w:rPr>
+        <w:t>dashboards</w:t>
+      </w:r>
+      <w:proofErr w:type="spellEnd"/>
+      <w:r>
+        <w:rPr>
+          <w:rFonts w:ascii="Times New Roman" w:hAnsi="Times New Roman" w:cs="Times New Roman"/>
+          <w:sz w:val="24"/>
+          <w:szCs w:val="24"/>
+        </w:rPr>
+        <w:t xml:space="preserve"> interactivos y visualización de datos, lo que permite que la implementación del sistema no requiera procesos complejos de adaptación.</w:t>
       </w:r>
     </w:p>
     <w:p>
@@ -9532,7 +10006,25 @@
           <w:sz w:val="24"/>
           <w:szCs w:val="24"/>
         </w:rPr>
-        <w:t>El sistema será diseñado considerando principios de usabilidad y accesibilidad, con el objetivo de que los usuarios puedan interactuar de manera sencilla e intuitiva con la información. A través de gráficos, indicadores y filtros dinámicos, el dashboard permitirá una navegación clara y eficiente, facilitando la comprensión de los resultados electorales y la comparación de propuestas de los candidatos.</w:t>
+        <w:t xml:space="preserve">El sistema será diseñado considerando principios de usabilidad y accesibilidad, con el objetivo de que los usuarios puedan interactuar de manera sencilla e intuitiva con la información. A través de gráficos, indicadores y filtros dinámicos, el </w:t>
+      </w:r>
+      <w:proofErr w:type="spellStart"/>
+      <w:r>
+        <w:rPr>
+          <w:rFonts w:ascii="Times New Roman" w:hAnsi="Times New Roman" w:cs="Times New Roman"/>
+          <w:sz w:val="24"/>
+          <w:szCs w:val="24"/>
+        </w:rPr>
+        <w:t>dashboard</w:t>
+      </w:r>
+      <w:proofErr w:type="spellEnd"/>
+      <w:r>
+        <w:rPr>
+          <w:rFonts w:ascii="Times New Roman" w:hAnsi="Times New Roman" w:cs="Times New Roman"/>
+          <w:sz w:val="24"/>
+          <w:szCs w:val="24"/>
+        </w:rPr>
+        <w:t xml:space="preserve"> permitirá una navegación clara y eficiente, facilitando la comprensión de los resultados electorales y la comparación de propuestas de los candidatos.</w:t>
       </w:r>
     </w:p>
     <w:p>
@@ -9580,7 +10072,25 @@
           <w:sz w:val="24"/>
           <w:szCs w:val="24"/>
         </w:rPr>
-        <w:t>Asimismo, el proyecto presenta una alta adaptabilidad, ya que puede integrarse fácilmente con diferentes fuentes de datos, como información oficial de entidades públicas o datasets abiertos. Esta característica permite mantener el sistema actualizado y mejorar su funcionalidad a lo largo del tiempo sin necesidad de realizar cambios estructurales complejos.</w:t>
+        <w:t xml:space="preserve">Asimismo, el proyecto presenta una alta adaptabilidad, ya que puede integrarse fácilmente con diferentes fuentes de datos, como información oficial de entidades públicas o </w:t>
+      </w:r>
+      <w:proofErr w:type="spellStart"/>
+      <w:r>
+        <w:rPr>
+          <w:rFonts w:ascii="Times New Roman" w:hAnsi="Times New Roman" w:cs="Times New Roman"/>
+          <w:sz w:val="24"/>
+          <w:szCs w:val="24"/>
+        </w:rPr>
+        <w:t>datasets</w:t>
+      </w:r>
+      <w:proofErr w:type="spellEnd"/>
+      <w:r>
+        <w:rPr>
+          <w:rFonts w:ascii="Times New Roman" w:hAnsi="Times New Roman" w:cs="Times New Roman"/>
+          <w:sz w:val="24"/>
+          <w:szCs w:val="24"/>
+        </w:rPr>
+        <w:t xml:space="preserve"> abiertos. Esta característica permite mantener el sistema actualizado y mejorar su funcionalidad a lo largo del tiempo sin necesidad de realizar cambios estructurales complejos.</w:t>
       </w:r>
     </w:p>
     <w:p>
@@ -9628,7 +10138,25 @@
           <w:sz w:val="24"/>
           <w:szCs w:val="24"/>
         </w:rPr>
-        <w:t>En cuanto al soporte y mantenimiento, el sistema requerirá actualizaciones periódicas para garantizar la calidad de la información, el correcto funcionamiento de los dashboards y la mejora continua de la experiencia del usuario. Estas actividades pueden ser gestionadas por el equipo de desarrollo sin requerir recursos adicionales significativos.</w:t>
+        <w:t xml:space="preserve">En cuanto al soporte y mantenimiento, el sistema requerirá actualizaciones periódicas para garantizar la calidad de la información, el correcto funcionamiento de los </w:t>
+      </w:r>
+      <w:proofErr w:type="spellStart"/>
+      <w:r>
+        <w:rPr>
+          <w:rFonts w:ascii="Times New Roman" w:hAnsi="Times New Roman" w:cs="Times New Roman"/>
+          <w:sz w:val="24"/>
+          <w:szCs w:val="24"/>
+        </w:rPr>
+        <w:t>dashboards</w:t>
+      </w:r>
+      <w:proofErr w:type="spellEnd"/>
+      <w:r>
+        <w:rPr>
+          <w:rFonts w:ascii="Times New Roman" w:hAnsi="Times New Roman" w:cs="Times New Roman"/>
+          <w:sz w:val="24"/>
+          <w:szCs w:val="24"/>
+        </w:rPr>
+        <w:t xml:space="preserve"> y la mejora continua de la experiencia del usuario. Estas actividades pueden ser gestionadas por el equipo de desarrollo sin requerir recursos adicionales significativos.</w:t>
       </w:r>
     </w:p>
     <w:p>
@@ -9676,7 +10204,43 @@
           <w:sz w:val="24"/>
           <w:szCs w:val="24"/>
         </w:rPr>
-        <w:t>Por otro lado, el proyecto contempla la posibilidad de incorporar mejoras continuas basadas en la retroalimentación de los usuarios, lo que permitirá optimizar el sistema y adaptarlo a nuevas necesidades. De esta manera, el dashboard no solo será funcional en su etapa inicial, sino que podrá evolucionar progresivamente.</w:t>
+        <w:t xml:space="preserve">Por otro lado, el proyecto contempla la posibilidad de incorporar mejoras </w:t>
+      </w:r>
+      <w:proofErr w:type="gramStart"/>
+      <w:r>
+        <w:rPr>
+          <w:rFonts w:ascii="Times New Roman" w:hAnsi="Times New Roman" w:cs="Times New Roman"/>
+          <w:sz w:val="24"/>
+          <w:szCs w:val="24"/>
+        </w:rPr>
+        <w:t>continuas</w:t>
+      </w:r>
+      <w:proofErr w:type="gramEnd"/>
+      <w:r>
+        <w:rPr>
+          <w:rFonts w:ascii="Times New Roman" w:hAnsi="Times New Roman" w:cs="Times New Roman"/>
+          <w:sz w:val="24"/>
+          <w:szCs w:val="24"/>
+        </w:rPr>
+        <w:t xml:space="preserve"> basadas en la retroalimentación de los usuarios, lo que permitirá optimizar el sistema y adaptarlo a nuevas necesidades. De esta manera, el </w:t>
+      </w:r>
+      <w:proofErr w:type="spellStart"/>
+      <w:r>
+        <w:rPr>
+          <w:rFonts w:ascii="Times New Roman" w:hAnsi="Times New Roman" w:cs="Times New Roman"/>
+          <w:sz w:val="24"/>
+          <w:szCs w:val="24"/>
+        </w:rPr>
+        <w:t>dashboard</w:t>
+      </w:r>
+      <w:proofErr w:type="spellEnd"/>
+      <w:r>
+        <w:rPr>
+          <w:rFonts w:ascii="Times New Roman" w:hAnsi="Times New Roman" w:cs="Times New Roman"/>
+          <w:sz w:val="24"/>
+          <w:szCs w:val="24"/>
+        </w:rPr>
+        <w:t xml:space="preserve"> no solo será funcional en su etapa inicial, sino que podrá evolucionar progresivamente.</w:t>
       </w:r>
     </w:p>
     <w:p>
@@ -9827,15 +10391,33 @@
           <w:sz w:val="24"/>
           <w:szCs w:val="24"/>
         </w:rPr>
-        <w:t xml:space="preserve">El </w:t>
-      </w:r>
-      <w:r>
-        <w:rPr>
-          <w:rFonts w:ascii="Times New Roman" w:hAnsi="Times New Roman" w:cs="Times New Roman"/>
-          <w:sz w:val="24"/>
-          <w:szCs w:val="24"/>
-        </w:rPr>
-        <w:t>La factibilidad legal del proyecto de dashboard de análisis electoral es alta, ya que se basa en el uso de información pública proveniente de fuentes oficiales, como datos electorales y planes de gobierno publicados por entidades del Estado. Esto garantiza que la información utilizada no infringe derechos de propiedad privada ni normas de confidencialidad.</w:t>
+        <w:t xml:space="preserve"> </w:t>
+      </w:r>
+      <w:r>
+        <w:rPr>
+          <w:rFonts w:ascii="Times New Roman" w:hAnsi="Times New Roman" w:cs="Times New Roman"/>
+          <w:sz w:val="24"/>
+          <w:szCs w:val="24"/>
+        </w:rPr>
+        <w:t xml:space="preserve">La factibilidad legal del proyecto de </w:t>
+      </w:r>
+      <w:proofErr w:type="spellStart"/>
+      <w:r>
+        <w:rPr>
+          <w:rFonts w:ascii="Times New Roman" w:hAnsi="Times New Roman" w:cs="Times New Roman"/>
+          <w:sz w:val="24"/>
+          <w:szCs w:val="24"/>
+        </w:rPr>
+        <w:t>dashboard</w:t>
+      </w:r>
+      <w:proofErr w:type="spellEnd"/>
+      <w:r>
+        <w:rPr>
+          <w:rFonts w:ascii="Times New Roman" w:hAnsi="Times New Roman" w:cs="Times New Roman"/>
+          <w:sz w:val="24"/>
+          <w:szCs w:val="24"/>
+        </w:rPr>
+        <w:t xml:space="preserve"> de análisis electoral es alta, ya que se basa en el uso de información pública proveniente de fuentes oficiales, como datos electorales y planes de gobierno publicados por entidades del Estado. Esto garantiza que la información utilizada no infringe derechos de propiedad privada ni normas de confidencialidad.</w:t>
       </w:r>
     </w:p>
     <w:p>
@@ -9881,7 +10463,25 @@
           <w:sz w:val="24"/>
           <w:szCs w:val="24"/>
         </w:rPr>
-        <w:t xml:space="preserve">Asimismo, el proyecto cumple con la normativa vigente en el Perú relacionada con la protección de datos personales, como la Ley N° 29733, Ley de Protección </w:t>
+        <w:t xml:space="preserve">Asimismo, el proyecto cumple con la normativa vigente en el Perú relacionada con la protección de datos personales, como la Ley </w:t>
+      </w:r>
+      <w:proofErr w:type="spellStart"/>
+      <w:r>
+        <w:rPr>
+          <w:rFonts w:ascii="Times New Roman" w:hAnsi="Times New Roman" w:cs="Times New Roman"/>
+          <w:sz w:val="24"/>
+          <w:szCs w:val="24"/>
+        </w:rPr>
+        <w:t>N°</w:t>
+      </w:r>
+      <w:proofErr w:type="spellEnd"/>
+      <w:r>
+        <w:rPr>
+          <w:rFonts w:ascii="Times New Roman" w:hAnsi="Times New Roman" w:cs="Times New Roman"/>
+          <w:sz w:val="24"/>
+          <w:szCs w:val="24"/>
+        </w:rPr>
+        <w:t xml:space="preserve"> 29733, Ley de Protección </w:t>
       </w:r>
       <w:r>
         <w:rPr>
@@ -9936,7 +10536,43 @@
           <w:sz w:val="24"/>
           <w:szCs w:val="24"/>
         </w:rPr>
-        <w:t>En cuanto al desarrollo del software, se respetan las licencias de las herramientas utilizadas, tales como Power BI, Python, Visual Studio Code y otras tecnologías de uso libre o educativo. Esto asegura que el sistema sea desarrollado de manera legal y sostenible.</w:t>
+        <w:t xml:space="preserve">En cuanto al desarrollo del software, se respetan las licencias de las herramientas utilizadas, tales como </w:t>
+      </w:r>
+      <w:proofErr w:type="spellStart"/>
+      <w:r>
+        <w:rPr>
+          <w:rFonts w:ascii="Times New Roman" w:hAnsi="Times New Roman" w:cs="Times New Roman"/>
+          <w:sz w:val="24"/>
+          <w:szCs w:val="24"/>
+        </w:rPr>
+        <w:t>Power</w:t>
+      </w:r>
+      <w:proofErr w:type="spellEnd"/>
+      <w:r>
+        <w:rPr>
+          <w:rFonts w:ascii="Times New Roman" w:hAnsi="Times New Roman" w:cs="Times New Roman"/>
+          <w:sz w:val="24"/>
+          <w:szCs w:val="24"/>
+        </w:rPr>
+        <w:t xml:space="preserve"> BI, Python, Visual Studio </w:t>
+      </w:r>
+      <w:proofErr w:type="spellStart"/>
+      <w:r>
+        <w:rPr>
+          <w:rFonts w:ascii="Times New Roman" w:hAnsi="Times New Roman" w:cs="Times New Roman"/>
+          <w:sz w:val="24"/>
+          <w:szCs w:val="24"/>
+        </w:rPr>
+        <w:t>Code</w:t>
+      </w:r>
+      <w:proofErr w:type="spellEnd"/>
+      <w:r>
+        <w:rPr>
+          <w:rFonts w:ascii="Times New Roman" w:hAnsi="Times New Roman" w:cs="Times New Roman"/>
+          <w:sz w:val="24"/>
+          <w:szCs w:val="24"/>
+        </w:rPr>
+        <w:t xml:space="preserve"> y otras tecnologías de uso libre o educativo. Esto asegura que el sistema sea desarrollado de manera legal y sostenible.</w:t>
       </w:r>
     </w:p>
     <w:p>
@@ -10114,7 +10750,27 @@
           <w:sz w:val="24"/>
           <w:szCs w:val="24"/>
         </w:rPr>
-        <w:t>La implementación de un dashboard de análisis electoral contribuye a fortalecer la transparencia informativa, permitiendo a los usuarios comprender mejor los resultados de las elecciones y las propuestas políticas. Esto favorece una toma de decisiones más informada y promueve una participación ciudadana más consciente.</w:t>
+        <w:t xml:space="preserve">La implementación de un </w:t>
+      </w:r>
+      <w:proofErr w:type="spellStart"/>
+      <w:r>
+        <w:rPr>
+          <w:rFonts w:ascii="Times New Roman" w:hAnsi="Times New Roman" w:cs="Times New Roman"/>
+          <w:color w:val="000000"/>
+          <w:sz w:val="24"/>
+          <w:szCs w:val="24"/>
+        </w:rPr>
+        <w:t>dashboard</w:t>
+      </w:r>
+      <w:proofErr w:type="spellEnd"/>
+      <w:r>
+        <w:rPr>
+          <w:rFonts w:ascii="Times New Roman" w:hAnsi="Times New Roman" w:cs="Times New Roman"/>
+          <w:color w:val="000000"/>
+          <w:sz w:val="24"/>
+          <w:szCs w:val="24"/>
+        </w:rPr>
+        <w:t xml:space="preserve"> de análisis electoral contribuye a fortalecer la transparencia informativa, permitiendo a los usuarios comprender mejor los resultados de las elecciones y las propuestas políticas. Esto favorece una toma de decisiones más informada y promueve una participación ciudadana más consciente.</w:t>
       </w:r>
     </w:p>
     <w:p>
@@ -10624,7 +11280,27 @@
           <w:sz w:val="24"/>
           <w:szCs w:val="24"/>
         </w:rPr>
-        <w:t>El proyecto de dashboard de análisis electoral se justifica económicamente debido a que permite optimizar el acceso, análisis y comprensión de la información electoral mediante el uso de herramientas tecnológicas de visualización de datos.</w:t>
+        <w:t xml:space="preserve">El proyecto de </w:t>
+      </w:r>
+      <w:proofErr w:type="spellStart"/>
+      <w:r>
+        <w:rPr>
+          <w:rFonts w:ascii="Times New Roman" w:hAnsi="Times New Roman" w:cs="Times New Roman"/>
+          <w:color w:val="000000"/>
+          <w:sz w:val="24"/>
+          <w:szCs w:val="24"/>
+        </w:rPr>
+        <w:t>dashboard</w:t>
+      </w:r>
+      <w:proofErr w:type="spellEnd"/>
+      <w:r>
+        <w:rPr>
+          <w:rFonts w:ascii="Times New Roman" w:hAnsi="Times New Roman" w:cs="Times New Roman"/>
+          <w:color w:val="000000"/>
+          <w:sz w:val="24"/>
+          <w:szCs w:val="24"/>
+        </w:rPr>
+        <w:t xml:space="preserve"> de análisis electoral se justifica económicamente debido a que permite optimizar el acceso, análisis y comprensión de la información electoral mediante el uso de herramientas tecnológicas de visualización de datos.</w:t>
       </w:r>
     </w:p>
     <w:p>
@@ -14334,8 +15010,8 @@
         </w:rPr>
       </w:pPr>
     </w:p>
-    <w:bookmarkStart w:id="7" w:name="_heading=h.2jxsxqh" w:colFirst="0" w:colLast="0"/>
-    <w:bookmarkEnd w:id="7"/>
+    <w:bookmarkStart w:id="8" w:name="_heading=h.2jxsxqh" w:colFirst="0" w:colLast="0"/>
+    <w:bookmarkEnd w:id="8"/>
     <w:p>
       <w:pPr>
         <w:spacing w:after="0" w:line="240" w:lineRule="auto"/>
@@ -14559,8 +15235,8 @@
           <w:szCs w:val="24"/>
         </w:rPr>
       </w:pPr>
-      <w:bookmarkStart w:id="8" w:name="_heading=h.wjnelt88qtef" w:colFirst="0" w:colLast="0"/>
-      <w:bookmarkEnd w:id="8"/>
+      <w:bookmarkStart w:id="9" w:name="_heading=h.wjnelt88qtef" w:colFirst="0" w:colLast="0"/>
+      <w:bookmarkEnd w:id="9"/>
     </w:p>
     <w:p>
       <w:pPr>
@@ -14581,8 +15257,8 @@
           <w:szCs w:val="24"/>
         </w:rPr>
       </w:pPr>
-      <w:bookmarkStart w:id="9" w:name="_heading=h.d0coibi3fdib" w:colFirst="0" w:colLast="0"/>
-      <w:bookmarkEnd w:id="9"/>
+      <w:bookmarkStart w:id="10" w:name="_heading=h.d0coibi3fdib" w:colFirst="0" w:colLast="0"/>
+      <w:bookmarkEnd w:id="10"/>
     </w:p>
     <w:p>
       <w:pPr>
@@ -14609,7 +15285,43 @@
           <w:szCs w:val="24"/>
         </w:rPr>
         <w:lastRenderedPageBreak/>
-        <w:t>En conclusión, el proyecto de dashboard de análisis electoral y evaluación de planes de gobierno – Perú 2021 es viable desde el punto de vista técnico, ya que se cuenta con herramientas accesibles y ampliamente utilizadas como Power BI, Excel y tecnologías de desarrollo que permiten implementar una solución eficiente, escalable y de fácil acceso para los usuarios.</w:t>
+        <w:t xml:space="preserve">En conclusión, el proyecto de </w:t>
+      </w:r>
+      <w:proofErr w:type="spellStart"/>
+      <w:r>
+        <w:rPr>
+          <w:rFonts w:ascii="Times New Roman" w:eastAsia="Roboto" w:hAnsi="Times New Roman" w:cs="Times New Roman"/>
+          <w:sz w:val="24"/>
+          <w:szCs w:val="24"/>
+        </w:rPr>
+        <w:t>dashboard</w:t>
+      </w:r>
+      <w:proofErr w:type="spellEnd"/>
+      <w:r>
+        <w:rPr>
+          <w:rFonts w:ascii="Times New Roman" w:eastAsia="Roboto" w:hAnsi="Times New Roman" w:cs="Times New Roman"/>
+          <w:sz w:val="24"/>
+          <w:szCs w:val="24"/>
+        </w:rPr>
+        <w:t xml:space="preserve"> de análisis electoral y evaluación de planes de gobierno – Perú 2021 es viable desde el punto de vista técnico, ya que se cuenta con herramientas accesibles y ampliamente utilizadas como </w:t>
+      </w:r>
+      <w:proofErr w:type="spellStart"/>
+      <w:r>
+        <w:rPr>
+          <w:rFonts w:ascii="Times New Roman" w:eastAsia="Roboto" w:hAnsi="Times New Roman" w:cs="Times New Roman"/>
+          <w:sz w:val="24"/>
+          <w:szCs w:val="24"/>
+        </w:rPr>
+        <w:t>Power</w:t>
+      </w:r>
+      <w:proofErr w:type="spellEnd"/>
+      <w:r>
+        <w:rPr>
+          <w:rFonts w:ascii="Times New Roman" w:eastAsia="Roboto" w:hAnsi="Times New Roman" w:cs="Times New Roman"/>
+          <w:sz w:val="24"/>
+          <w:szCs w:val="24"/>
+        </w:rPr>
+        <w:t xml:space="preserve"> BI, Excel y tecnologías de desarrollo que permiten implementar una solución eficiente, escalable y de fácil acceso para los usuarios.</w:t>
       </w:r>
     </w:p>
     <w:p>
@@ -14682,7 +15394,25 @@
           <w:sz w:val="24"/>
           <w:szCs w:val="24"/>
         </w:rPr>
-        <w:t>En cuanto a la factibilidad operativa, el sistema es viable debido a que los usuarios están familiarizados con el uso de herramientas digitales y dashboards, lo que facilita su implementación, uso y mantenimiento sin requerir procesos complejos de capacitación.</w:t>
+        <w:t xml:space="preserve">En cuanto a la factibilidad operativa, el sistema es viable debido a que los usuarios están familiarizados con el uso de herramientas digitales y </w:t>
+      </w:r>
+      <w:proofErr w:type="spellStart"/>
+      <w:r>
+        <w:rPr>
+          <w:rFonts w:ascii="Times New Roman" w:eastAsia="Roboto" w:hAnsi="Times New Roman" w:cs="Times New Roman"/>
+          <w:sz w:val="24"/>
+          <w:szCs w:val="24"/>
+        </w:rPr>
+        <w:t>dashboards</w:t>
+      </w:r>
+      <w:proofErr w:type="spellEnd"/>
+      <w:r>
+        <w:rPr>
+          <w:rFonts w:ascii="Times New Roman" w:eastAsia="Roboto" w:hAnsi="Times New Roman" w:cs="Times New Roman"/>
+          <w:sz w:val="24"/>
+          <w:szCs w:val="24"/>
+        </w:rPr>
+        <w:t>, lo que facilita su implementación, uso y mantenimiento sin requerir procesos complejos de capacitación.</w:t>
       </w:r>
     </w:p>
     <w:p>
@@ -17905,6 +18635,7 @@
   <w:style w:type="character" w:default="1" w:styleId="Fuentedeprrafopredeter">
     <w:name w:val="Default Paragraph Font"/>
     <w:uiPriority w:val="1"/>
+    <w:semiHidden/>
     <w:unhideWhenUsed/>
   </w:style>
   <w:style w:type="table" w:default="1" w:styleId="Tablanormal">

</xml_diff>

<commit_message>
agregando dashboard parte 1
</commit_message>
<xml_diff>
--- a/FD01-EPIS-Informe de Factibilidad de Proyecto .docx
+++ b/FD01-EPIS-Informe de Factibilidad de Proyecto .docx
@@ -279,7 +279,17 @@
           <w:sz w:val="32"/>
           <w:szCs w:val="32"/>
         </w:rPr>
-        <w:t>Perú 2021</w:t>
+        <w:t>Perú 202</w:t>
+      </w:r>
+      <w:r>
+        <w:rPr>
+          <w:rFonts w:ascii="Times New Roman" w:eastAsia="Arial" w:hAnsi="Times New Roman" w:cs="Times New Roman"/>
+          <w:b/>
+          <w:bCs/>
+          <w:sz w:val="32"/>
+          <w:szCs w:val="32"/>
+        </w:rPr>
+        <w:t>6</w:t>
       </w:r>
       <w:r>
         <w:rPr>
@@ -942,7 +952,14 @@
           <w:rFonts w:ascii="Times New Roman" w:eastAsia="Times New Roman" w:hAnsi="Times New Roman" w:cs="Times New Roman"/>
           <w:color w:val="000000"/>
         </w:rPr>
-        <w:t xml:space="preserve"> de análisis electoral y evaluación de planes de gobierno – Perú 2021</w:t>
+        <w:t xml:space="preserve"> de análisis electoral y evaluación de planes de gobierno – Perú 202</w:t>
+      </w:r>
+      <w:r>
+        <w:rPr>
+          <w:rFonts w:ascii="Times New Roman" w:eastAsia="Times New Roman" w:hAnsi="Times New Roman" w:cs="Times New Roman"/>
+          <w:color w:val="000000"/>
+        </w:rPr>
+        <w:t>6</w:t>
       </w:r>
     </w:p>
     <w:p>
@@ -2121,7 +2138,15 @@
           <w:sz w:val="24"/>
           <w:szCs w:val="24"/>
         </w:rPr>
-        <w:t xml:space="preserve"> de análisis electoral y evaluación de planes de gobierno – Perú 2021</w:t>
+        <w:t xml:space="preserve"> de análisis electoral y evaluación de planes de gobierno – Perú 202</w:t>
+      </w:r>
+      <w:r>
+        <w:rPr>
+          <w:rFonts w:ascii="Times New Roman" w:hAnsi="Times New Roman" w:cs="Times New Roman"/>
+          <w:sz w:val="24"/>
+          <w:szCs w:val="24"/>
+        </w:rPr>
+        <w:t>6</w:t>
       </w:r>
     </w:p>
     <w:p>
@@ -2409,7 +2434,7 @@
     <w:p>
       <w:pPr>
         <w:spacing w:before="240" w:after="240" w:line="360" w:lineRule="auto"/>
-        <w:ind w:left="284" w:firstLine="720"/>
+        <w:ind w:left="720"/>
         <w:jc w:val="both"/>
         <w:rPr>
           <w:rFonts w:ascii="Times New Roman" w:hAnsi="Times New Roman" w:cs="Times New Roman"/>
@@ -2441,25 +2466,53 @@
           <w:sz w:val="24"/>
           <w:szCs w:val="24"/>
         </w:rPr>
-        <w:t xml:space="preserve"> interactivo de análisis electoral y evaluación de planes de gobierno, basado en las Elecciones Generales del Perú 2021. La solución busca integrar, organizar y visualizar información electoral relevante, permitiendo analizar resultados, comparar candidatos presidenciales y evaluar sus principales propuestas de gobierno.</w:t>
+        <w:t xml:space="preserve"> interactivo para el análisis de candidatos presidenciales y la evaluación de sus planes de gobierno en el contexto de las Elecciones Generales del Perú 2026. La solución integra información relevante de cada candidato, como datos personales, perfil socioeconómico y características generales, junto con el análisis estructurado de sus propuestas políticas.</w:t>
       </w:r>
     </w:p>
     <w:p>
       <w:pPr>
         <w:spacing w:before="240" w:after="240" w:line="360" w:lineRule="auto"/>
-        <w:ind w:left="284" w:firstLine="720"/>
-        <w:jc w:val="both"/>
-        <w:rPr>
-          <w:rFonts w:ascii="Times New Roman" w:hAnsi="Times New Roman" w:cs="Times New Roman"/>
-          <w:sz w:val="24"/>
-          <w:szCs w:val="24"/>
-        </w:rPr>
-      </w:pPr>
+        <w:ind w:left="720"/>
+        <w:jc w:val="both"/>
+        <w:rPr>
+          <w:rFonts w:ascii="Times New Roman" w:hAnsi="Times New Roman" w:cs="Times New Roman"/>
+          <w:sz w:val="24"/>
+          <w:szCs w:val="24"/>
+        </w:rPr>
+      </w:pPr>
+      <w:r>
+        <w:rPr>
+          <w:rFonts w:ascii="Times New Roman" w:hAnsi="Times New Roman" w:cs="Times New Roman"/>
+          <w:sz w:val="24"/>
+          <w:szCs w:val="24"/>
+        </w:rPr>
+        <w:t>El sistema permite organizar y visualizar la información de manera dinámica, facilitando la exploración individual de cada candidato mediante filtros interactivos, así como la comparación de sus planes de gobierno según dimensiones como social, económica, institucional y territorial-ambiental.</w:t>
+      </w:r>
     </w:p>
     <w:p>
       <w:pPr>
         <w:spacing w:before="240" w:after="240" w:line="360" w:lineRule="auto"/>
-        <w:ind w:left="284" w:firstLine="720"/>
+        <w:ind w:left="720"/>
+        <w:jc w:val="both"/>
+        <w:rPr>
+          <w:rFonts w:ascii="Times New Roman" w:hAnsi="Times New Roman" w:cs="Times New Roman"/>
+          <w:sz w:val="24"/>
+          <w:szCs w:val="24"/>
+        </w:rPr>
+      </w:pPr>
+      <w:r>
+        <w:rPr>
+          <w:rFonts w:ascii="Times New Roman" w:hAnsi="Times New Roman" w:cs="Times New Roman"/>
+          <w:sz w:val="24"/>
+          <w:szCs w:val="24"/>
+        </w:rPr>
+        <w:t>Asimismo, las propuestas contenidas en los planes de gobierno son clasificadas en temas clave como salud, educación, seguridad, economía y vivienda, permitiendo identificar las prioridades, enfoques y estrategias de cada organización política.</w:t>
+      </w:r>
+    </w:p>
+    <w:p>
+      <w:pPr>
+        <w:spacing w:before="240" w:after="240" w:line="360" w:lineRule="auto"/>
+        <w:ind w:left="720"/>
         <w:jc w:val="both"/>
         <w:rPr>
           <w:rFonts w:ascii="Times New Roman" w:hAnsi="Times New Roman" w:cs="Times New Roman"/>
@@ -2491,92 +2544,48 @@
           <w:sz w:val="24"/>
           <w:szCs w:val="24"/>
         </w:rPr>
-        <w:t xml:space="preserve"> permitirá representar datos como votos obtenidos por candidato, distribución porcentual de resultados, comparación de propuestas por sectores y análisis de viabilidad según criterios como impacto, costo estimado y alineación con necesidades sociales. De esta manera, se busca transformar información electoral dispersa en una herramienta visual, clara y útil para la toma de decisiones.</w:t>
+        <w:t xml:space="preserve"> transforma información compleja y dispersa en una herramienta visual clara, permitiendo analizar tanto el perfil de los candidatos como el contenido de sus propuestas, favoreciendo una comprensión integral del panorama político.</w:t>
       </w:r>
     </w:p>
     <w:p>
       <w:pPr>
         <w:spacing w:before="240" w:after="240" w:line="360" w:lineRule="auto"/>
-        <w:ind w:left="284" w:firstLine="720"/>
-        <w:jc w:val="both"/>
-        <w:rPr>
-          <w:rFonts w:ascii="Times New Roman" w:hAnsi="Times New Roman" w:cs="Times New Roman"/>
-          <w:sz w:val="24"/>
-          <w:szCs w:val="24"/>
-        </w:rPr>
-      </w:pPr>
+        <w:ind w:left="720"/>
+        <w:jc w:val="both"/>
+        <w:rPr>
+          <w:rFonts w:ascii="Times New Roman" w:hAnsi="Times New Roman" w:cs="Times New Roman"/>
+          <w:sz w:val="24"/>
+          <w:szCs w:val="24"/>
+        </w:rPr>
+      </w:pPr>
+      <w:r>
+        <w:rPr>
+          <w:rFonts w:ascii="Times New Roman" w:hAnsi="Times New Roman" w:cs="Times New Roman"/>
+          <w:sz w:val="24"/>
+          <w:szCs w:val="24"/>
+        </w:rPr>
+        <w:lastRenderedPageBreak/>
+        <w:t>El proyecto está orientado a estudiantes, ciudadanos y analistas interesados en el análisis electoral, proporcionando una plataforma que promueve la transparencia, el acceso a la información y la toma de decisiones informadas.</w:t>
+      </w:r>
     </w:p>
     <w:p>
       <w:pPr>
         <w:spacing w:before="240" w:after="240" w:line="360" w:lineRule="auto"/>
-        <w:ind w:left="284" w:firstLine="720"/>
-        <w:jc w:val="both"/>
-        <w:rPr>
-          <w:rFonts w:ascii="Times New Roman" w:hAnsi="Times New Roman" w:cs="Times New Roman"/>
-          <w:sz w:val="24"/>
-          <w:szCs w:val="24"/>
-        </w:rPr>
-      </w:pPr>
-      <w:r>
-        <w:rPr>
-          <w:rFonts w:ascii="Times New Roman" w:hAnsi="Times New Roman" w:cs="Times New Roman"/>
-          <w:sz w:val="24"/>
-          <w:szCs w:val="24"/>
-        </w:rPr>
-        <w:t>Asimismo, el proyecto incorporará información relacionada con los planes de gobierno de los principales candidatos presidenciales, clasificando sus propuestas en sectores como educación, salud, economía, seguridad e infraestructura. Esta clasificación permitirá comparar de forma objetiva las prioridades de cada candidato.</w:t>
-      </w:r>
-    </w:p>
-    <w:p>
-      <w:pPr>
-        <w:spacing w:before="240" w:after="240" w:line="360" w:lineRule="auto"/>
-        <w:ind w:left="284" w:firstLine="720"/>
-        <w:jc w:val="both"/>
-        <w:rPr>
-          <w:rFonts w:ascii="Times New Roman" w:hAnsi="Times New Roman" w:cs="Times New Roman"/>
-          <w:sz w:val="24"/>
-          <w:szCs w:val="24"/>
-        </w:rPr>
-      </w:pPr>
-    </w:p>
-    <w:p>
-      <w:pPr>
-        <w:spacing w:before="240" w:after="240" w:line="360" w:lineRule="auto"/>
-        <w:ind w:left="284" w:firstLine="720"/>
-        <w:jc w:val="both"/>
-        <w:rPr>
-          <w:rFonts w:ascii="Times New Roman" w:hAnsi="Times New Roman" w:cs="Times New Roman"/>
-          <w:sz w:val="24"/>
-          <w:szCs w:val="24"/>
-        </w:rPr>
-      </w:pPr>
-      <w:r>
-        <w:rPr>
-          <w:rFonts w:ascii="Times New Roman" w:hAnsi="Times New Roman" w:cs="Times New Roman"/>
-          <w:sz w:val="24"/>
-          <w:szCs w:val="24"/>
-        </w:rPr>
-        <w:lastRenderedPageBreak/>
-        <w:t>El sistema estará orientado a estudiantes, ciudadanos, analistas y usuarios interesados en comprender mejor el proceso electoral peruano, brindando una plataforma que facilite la interpretación de datos políticos y electorales mediante gráficos, indicadores y reportes visuales.</w:t>
-      </w:r>
-    </w:p>
-    <w:p>
-      <w:pPr>
-        <w:spacing w:before="240" w:after="240" w:line="360" w:lineRule="auto"/>
-        <w:ind w:left="284" w:firstLine="720"/>
-        <w:jc w:val="both"/>
-        <w:rPr>
-          <w:rFonts w:ascii="Times New Roman" w:hAnsi="Times New Roman" w:cs="Times New Roman"/>
-          <w:sz w:val="24"/>
-          <w:szCs w:val="24"/>
-        </w:rPr>
-      </w:pPr>
-      <w:r>
-        <w:rPr>
-          <w:rFonts w:ascii="Times New Roman" w:hAnsi="Times New Roman" w:cs="Times New Roman"/>
-          <w:sz w:val="24"/>
-          <w:szCs w:val="24"/>
-        </w:rPr>
-        <w:t>En resumen, el proyecto representa una solución tecnológica enfocada en el análisis de datos electorales, la transparencia de la información y la comparación estructurada de planes de gobierno, contribuyendo al fortalecimiento de la cultura democrática y la toma de decisiones informadas.</w:t>
+        <w:ind w:left="720"/>
+        <w:jc w:val="both"/>
+        <w:rPr>
+          <w:rFonts w:ascii="Times New Roman" w:hAnsi="Times New Roman" w:cs="Times New Roman"/>
+          <w:sz w:val="24"/>
+          <w:szCs w:val="24"/>
+        </w:rPr>
+      </w:pPr>
+      <w:r>
+        <w:rPr>
+          <w:rFonts w:ascii="Times New Roman" w:hAnsi="Times New Roman" w:cs="Times New Roman"/>
+          <w:sz w:val="24"/>
+          <w:szCs w:val="24"/>
+        </w:rPr>
+        <w:t>En resumen, esta solución tecnológica integra el análisis de datos de candidatos presidenciales con la evaluación comparativa de planes de gobierno, contribuyendo al fortalecimiento de la cultura democrática en el Perú.</w:t>
       </w:r>
     </w:p>
     <w:p>
@@ -2665,31 +2674,35 @@
           <w:sz w:val="24"/>
           <w:szCs w:val="24"/>
         </w:rPr>
-        <w:t xml:space="preserve"> interactivo de análisis electoral y evaluación de planes de gobierno basado en las Elecciones Generales del Perú 2021, que permita visualizar resultados, comparar candidatos y analizar la viabilidad de sus propuestas mediante indicadores gráficos y métricas de evaluación.</w:t>
-      </w:r>
-    </w:p>
-    <w:p>
-      <w:pPr>
+        <w:t xml:space="preserve"> interactivo que permita analizar el perfil de los candidatos presidenciales y evaluar comparativamente sus planes de gobierno en el Perú para las Elecciones Generales 2026, mediante visualizaciones dinámicas e indicadores que faciliten la interpretación de la información.</w:t>
+      </w:r>
+    </w:p>
+    <w:p>
+      <w:pPr>
+        <w:pStyle w:val="Prrafodelista"/>
+        <w:numPr>
+          <w:ilvl w:val="2"/>
+          <w:numId w:val="21"/>
+        </w:numPr>
         <w:spacing w:before="120" w:after="0" w:line="360" w:lineRule="auto"/>
-        <w:ind w:left="360" w:hanging="76"/>
-        <w:jc w:val="both"/>
-        <w:rPr>
-          <w:rFonts w:ascii="Times New Roman" w:hAnsi="Times New Roman" w:cs="Times New Roman"/>
-          <w:b/>
-          <w:bCs/>
-          <w:sz w:val="24"/>
-          <w:szCs w:val="24"/>
-        </w:rPr>
-      </w:pPr>
-      <w:r>
-        <w:rPr>
-          <w:rFonts w:ascii="Times New Roman" w:hAnsi="Times New Roman" w:cs="Times New Roman"/>
-          <w:b/>
-          <w:bCs/>
-          <w:sz w:val="24"/>
-          <w:szCs w:val="24"/>
-        </w:rPr>
-        <w:t xml:space="preserve">        1.4.2 Objetivos Específicos</w:t>
+        <w:jc w:val="both"/>
+        <w:rPr>
+          <w:rFonts w:ascii="Times New Roman" w:hAnsi="Times New Roman" w:cs="Times New Roman"/>
+          <w:b/>
+          <w:bCs/>
+          <w:sz w:val="24"/>
+          <w:szCs w:val="24"/>
+        </w:rPr>
+      </w:pPr>
+      <w:r>
+        <w:rPr>
+          <w:rFonts w:ascii="Times New Roman" w:hAnsi="Times New Roman" w:cs="Times New Roman"/>
+          <w:b/>
+          <w:bCs/>
+          <w:sz w:val="24"/>
+          <w:szCs w:val="24"/>
+        </w:rPr>
+        <w:t>Objetivos Específicos</w:t>
       </w:r>
     </w:p>
     <w:p>
@@ -2715,7 +2728,7 @@
           <w:sz w:val="24"/>
           <w:szCs w:val="24"/>
         </w:rPr>
-        <w:t>Recopilar y organizar información electoral de las Elecciones Generales del Perú 2021.</w:t>
+        <w:t>Integrar información relevante de los candidatos presidenciales, incluyendo datos personales, características socioeconómicas y trayectoria.</w:t>
       </w:r>
     </w:p>
     <w:p>
@@ -2741,7 +2754,7 @@
           <w:sz w:val="24"/>
           <w:szCs w:val="24"/>
         </w:rPr>
-        <w:t>Identificar a los principales candidatos presidenciales y sus propuestas de gobierno.</w:t>
+        <w:t>Diseñar visualizaciones que permitan analizar individualmente a cada candidato mediante filtros dinámicos.</w:t>
       </w:r>
     </w:p>
     <w:p>
@@ -2767,7 +2780,7 @@
           <w:sz w:val="24"/>
           <w:szCs w:val="24"/>
         </w:rPr>
-        <w:t>Clasificar las propuestas por sectores como educación, salud, economía, seguridad e infraestructura.</w:t>
+        <w:t>Recopilar y estructurar los planes de gobierno de los partidos políticos participantes.</w:t>
       </w:r>
     </w:p>
     <w:p>
@@ -2793,7 +2806,7 @@
           <w:sz w:val="24"/>
           <w:szCs w:val="24"/>
         </w:rPr>
-        <w:t>Diseñar indicadores que permitan evaluar el costo estimado, impacto y viabilidad de las propuestas.</w:t>
+        <w:t>Clasificar las propuestas según dimensiones (social, económica, institucional y territorial-ambiental) y temas específicos como salud, educación, seguridad y economía.</w:t>
       </w:r>
     </w:p>
     <w:p>
@@ -2819,27 +2832,7 @@
           <w:sz w:val="24"/>
           <w:szCs w:val="24"/>
         </w:rPr>
-        <w:t xml:space="preserve">Implementar </w:t>
-      </w:r>
-      <w:proofErr w:type="spellStart"/>
-      <w:r>
-        <w:rPr>
-          <w:rFonts w:ascii="Times New Roman" w:hAnsi="Times New Roman" w:cs="Times New Roman"/>
-          <w:color w:val="000000"/>
-          <w:sz w:val="24"/>
-          <w:szCs w:val="24"/>
-        </w:rPr>
-        <w:t>dashboards</w:t>
-      </w:r>
-      <w:proofErr w:type="spellEnd"/>
-      <w:r>
-        <w:rPr>
-          <w:rFonts w:ascii="Times New Roman" w:hAnsi="Times New Roman" w:cs="Times New Roman"/>
-          <w:color w:val="000000"/>
-          <w:sz w:val="24"/>
-          <w:szCs w:val="24"/>
-        </w:rPr>
-        <w:t xml:space="preserve"> o reportes visuales que faciliten la comparación entre candidatos.</w:t>
+        <w:t>Implementar herramientas visuales que permitan comparar las propuestas entre candidatos y partidos políticos.</w:t>
       </w:r>
     </w:p>
     <w:p>
@@ -2865,7 +2858,7 @@
           <w:sz w:val="24"/>
           <w:szCs w:val="24"/>
         </w:rPr>
-        <w:t>Desarrollar una estructura de datos que permita alimentar los gráficos e indicadores del sistema.</w:t>
+        <w:t>Analizar la relación entre el perfil del candidato y las prioridades de su plan de gobierno.</w:t>
       </w:r>
     </w:p>
     <w:p>
@@ -2891,7 +2884,27 @@
           <w:sz w:val="24"/>
           <w:szCs w:val="24"/>
         </w:rPr>
-        <w:t>Publicar el proyecto en un entorno accesible para su revisión y presentación.</w:t>
+        <w:t xml:space="preserve">Publicar el </w:t>
+      </w:r>
+      <w:proofErr w:type="spellStart"/>
+      <w:r>
+        <w:rPr>
+          <w:rFonts w:ascii="Times New Roman" w:hAnsi="Times New Roman" w:cs="Times New Roman"/>
+          <w:color w:val="000000"/>
+          <w:sz w:val="24"/>
+          <w:szCs w:val="24"/>
+        </w:rPr>
+        <w:t>dashboard</w:t>
+      </w:r>
+      <w:proofErr w:type="spellEnd"/>
+      <w:r>
+        <w:rPr>
+          <w:rFonts w:ascii="Times New Roman" w:hAnsi="Times New Roman" w:cs="Times New Roman"/>
+          <w:color w:val="000000"/>
+          <w:sz w:val="24"/>
+          <w:szCs w:val="24"/>
+        </w:rPr>
+        <w:t xml:space="preserve"> en un entorno accesible que permita su visualización e interacción.</w:t>
       </w:r>
     </w:p>
     <w:p>
@@ -2902,8 +2915,7 @@
         <w:jc w:val="both"/>
         <w:rPr>
           <w:rFonts w:ascii="Times New Roman" w:hAnsi="Times New Roman" w:cs="Times New Roman"/>
-          <w:b/>
-          <w:bCs/>
+          <w:color w:val="000000"/>
           <w:sz w:val="24"/>
           <w:szCs w:val="24"/>
         </w:rPr>
@@ -2913,7 +2925,7 @@
       <w:pPr>
         <w:numPr>
           <w:ilvl w:val="0"/>
-          <w:numId w:val="5"/>
+          <w:numId w:val="21"/>
         </w:numPr>
         <w:pBdr>
           <w:top w:val="nil"/>
@@ -3258,7 +3270,7 @@
       <w:pPr>
         <w:numPr>
           <w:ilvl w:val="0"/>
-          <w:numId w:val="5"/>
+          <w:numId w:val="21"/>
         </w:numPr>
         <w:pBdr>
           <w:top w:val="nil"/>
@@ -3294,7 +3306,7 @@
       <w:pPr>
         <w:numPr>
           <w:ilvl w:val="1"/>
-          <w:numId w:val="5"/>
+          <w:numId w:val="21"/>
         </w:numPr>
         <w:pBdr>
           <w:top w:val="nil"/>
@@ -3361,7 +3373,15 @@
           <w:sz w:val="24"/>
           <w:szCs w:val="24"/>
         </w:rPr>
-        <w:t>En el Perú, la información electoral y los planes de gobierno suelen encontrarse distribuidos en diferentes fuentes, documentos oficiales, portales institucionales y medios digitales. Esta dispersión dificulta que los ciudadanos puedan analizar de manera rápida y clara las propuestas de los candidatos presidenciales.</w:t>
+        <w:t>E</w:t>
+      </w:r>
+      <w:r>
+        <w:rPr>
+          <w:rFonts w:ascii="Times New Roman" w:hAnsi="Times New Roman" w:cs="Times New Roman"/>
+          <w:sz w:val="24"/>
+          <w:szCs w:val="24"/>
+        </w:rPr>
+        <w:t>n el Perú, la información relacionada con los candidatos presidenciales y sus planes de gobierno se encuentra distribuida en múltiples fuentes, como documentos oficiales, portales institucionales y medios digitales. Esta dispersión dificulta el acceso, análisis y comprensión de las propuestas políticas por parte de los ciudadanos.</w:t>
       </w:r>
     </w:p>
     <w:p>
@@ -3382,14 +3402,6 @@
           <w:szCs w:val="24"/>
         </w:rPr>
       </w:pPr>
-      <w:r>
-        <w:rPr>
-          <w:rFonts w:ascii="Times New Roman" w:hAnsi="Times New Roman" w:cs="Times New Roman"/>
-          <w:sz w:val="24"/>
-          <w:szCs w:val="24"/>
-        </w:rPr>
-        <w:t>Durante las Elecciones Generales del Perú 2021, los ciudadanos tuvieron acceso a diversos planes de gobierno; sin embargo, estos documentos suelen ser extensos, técnicos y poco comparables entre sí. Esto limita la capacidad de los electores para identificar diferencias entre candidatos, prioridades de gobierno y niveles de viabilidad de las propuestas.</w:t>
-      </w:r>
     </w:p>
     <w:p>
       <w:pPr>
@@ -3415,7 +3427,7 @@
           <w:sz w:val="24"/>
           <w:szCs w:val="24"/>
         </w:rPr>
-        <w:t>Asimismo, los resultados electorales suelen presentarse en plataformas oficiales, pero muchas veces no se integran con el análisis de propuestas o indicadores de impacto. Por ello, existe la necesidad de una herramienta que combine visualización electoral, comparación de candidatos y evaluación de planes de gobierno en un solo entorno.</w:t>
+        <w:t>En el contexto de las Elecciones Generales del Perú 2026, los planes de gobierno de los partidos políticos contienen una gran cantidad de información estructurada en problemas, objetivos, indicadores y metas; sin embargo, estos documentos suelen ser extensos, técnicos y poco estandarizados, lo que dificulta su comparación directa entre candidatos.</w:t>
       </w:r>
     </w:p>
     <w:p>
@@ -3436,32 +3448,6 @@
           <w:szCs w:val="24"/>
         </w:rPr>
       </w:pPr>
-      <w:r>
-        <w:rPr>
-          <w:rFonts w:ascii="Times New Roman" w:hAnsi="Times New Roman" w:cs="Times New Roman"/>
-          <w:sz w:val="24"/>
-          <w:szCs w:val="24"/>
-        </w:rPr>
-        <w:t xml:space="preserve">En este contexto, se propone desarrollar un </w:t>
-      </w:r>
-      <w:proofErr w:type="spellStart"/>
-      <w:r>
-        <w:rPr>
-          <w:rFonts w:ascii="Times New Roman" w:hAnsi="Times New Roman" w:cs="Times New Roman"/>
-          <w:sz w:val="24"/>
-          <w:szCs w:val="24"/>
-        </w:rPr>
-        <w:t>dashboard</w:t>
-      </w:r>
-      <w:proofErr w:type="spellEnd"/>
-      <w:r>
-        <w:rPr>
-          <w:rFonts w:ascii="Times New Roman" w:hAnsi="Times New Roman" w:cs="Times New Roman"/>
-          <w:sz w:val="24"/>
-          <w:szCs w:val="24"/>
-        </w:rPr>
-        <w:t xml:space="preserve"> de análisis electoral y evaluación de planes de gobierno basado en las Elecciones Generales del Perú 2021, con el objetivo de facilitar la interpretación de datos, fortalecer la transparencia informativa y promover una toma de decisiones más informada.</w:t>
-      </w:r>
     </w:p>
     <w:p>
       <w:pPr>
@@ -3477,6 +3463,190 @@
         <w:jc w:val="both"/>
         <w:rPr>
           <w:rFonts w:ascii="Times New Roman" w:hAnsi="Times New Roman" w:cs="Times New Roman"/>
+          <w:sz w:val="24"/>
+          <w:szCs w:val="24"/>
+        </w:rPr>
+      </w:pPr>
+      <w:r>
+        <w:rPr>
+          <w:rFonts w:ascii="Times New Roman" w:hAnsi="Times New Roman" w:cs="Times New Roman"/>
+          <w:sz w:val="24"/>
+          <w:szCs w:val="24"/>
+        </w:rPr>
+        <w:t>Asimismo, no existe una herramienta integrada que permita visualizar de manera conjunta el perfil de los candidatos presidenciales junto con el contenido de sus propuestas, lo que limita el análisis de sus prioridades, enfoques y estrategias de gobierno.</w:t>
+      </w:r>
+    </w:p>
+    <w:p>
+      <w:pPr>
+        <w:pBdr>
+          <w:top w:val="nil"/>
+          <w:left w:val="nil"/>
+          <w:bottom w:val="nil"/>
+          <w:right w:val="nil"/>
+          <w:between w:val="nil"/>
+        </w:pBdr>
+        <w:spacing w:after="0" w:line="360" w:lineRule="auto"/>
+        <w:ind w:left="709"/>
+        <w:jc w:val="both"/>
+        <w:rPr>
+          <w:rFonts w:ascii="Times New Roman" w:hAnsi="Times New Roman" w:cs="Times New Roman"/>
+          <w:sz w:val="24"/>
+          <w:szCs w:val="24"/>
+        </w:rPr>
+      </w:pPr>
+    </w:p>
+    <w:p>
+      <w:pPr>
+        <w:pBdr>
+          <w:top w:val="nil"/>
+          <w:left w:val="nil"/>
+          <w:bottom w:val="nil"/>
+          <w:right w:val="nil"/>
+          <w:between w:val="nil"/>
+        </w:pBdr>
+        <w:spacing w:after="0" w:line="360" w:lineRule="auto"/>
+        <w:ind w:left="709"/>
+        <w:jc w:val="both"/>
+        <w:rPr>
+          <w:rFonts w:ascii="Times New Roman" w:hAnsi="Times New Roman" w:cs="Times New Roman"/>
+          <w:sz w:val="24"/>
+          <w:szCs w:val="24"/>
+        </w:rPr>
+      </w:pPr>
+      <w:r>
+        <w:rPr>
+          <w:rFonts w:ascii="Times New Roman" w:hAnsi="Times New Roman" w:cs="Times New Roman"/>
+          <w:sz w:val="24"/>
+          <w:szCs w:val="24"/>
+        </w:rPr>
+        <w:lastRenderedPageBreak/>
+        <w:t>Esta situación genera una brecha en la capacidad de los ciudadanos, estudiantes y analistas para interpretar de forma clara la información política disponible, dificultando la toma de decisiones informadas.</w:t>
+      </w:r>
+    </w:p>
+    <w:p>
+      <w:pPr>
+        <w:pBdr>
+          <w:top w:val="nil"/>
+          <w:left w:val="nil"/>
+          <w:bottom w:val="nil"/>
+          <w:right w:val="nil"/>
+          <w:between w:val="nil"/>
+        </w:pBdr>
+        <w:spacing w:after="0" w:line="360" w:lineRule="auto"/>
+        <w:ind w:left="709"/>
+        <w:jc w:val="both"/>
+        <w:rPr>
+          <w:rFonts w:ascii="Times New Roman" w:hAnsi="Times New Roman" w:cs="Times New Roman"/>
+          <w:sz w:val="24"/>
+          <w:szCs w:val="24"/>
+        </w:rPr>
+      </w:pPr>
+    </w:p>
+    <w:p>
+      <w:pPr>
+        <w:pBdr>
+          <w:top w:val="nil"/>
+          <w:left w:val="nil"/>
+          <w:bottom w:val="nil"/>
+          <w:right w:val="nil"/>
+          <w:between w:val="nil"/>
+        </w:pBdr>
+        <w:spacing w:after="0" w:line="360" w:lineRule="auto"/>
+        <w:ind w:left="709"/>
+        <w:jc w:val="both"/>
+        <w:rPr>
+          <w:rFonts w:ascii="Times New Roman" w:hAnsi="Times New Roman" w:cs="Times New Roman"/>
+          <w:sz w:val="24"/>
+          <w:szCs w:val="24"/>
+        </w:rPr>
+      </w:pPr>
+      <w:r>
+        <w:rPr>
+          <w:rFonts w:ascii="Times New Roman" w:hAnsi="Times New Roman" w:cs="Times New Roman"/>
+          <w:sz w:val="24"/>
+          <w:szCs w:val="24"/>
+        </w:rPr>
+        <w:t xml:space="preserve">En este contexto, surge la necesidad de desarrollar un </w:t>
+      </w:r>
+      <w:proofErr w:type="spellStart"/>
+      <w:r>
+        <w:rPr>
+          <w:rFonts w:ascii="Times New Roman" w:hAnsi="Times New Roman" w:cs="Times New Roman"/>
+          <w:sz w:val="24"/>
+          <w:szCs w:val="24"/>
+        </w:rPr>
+        <w:t>dashboard</w:t>
+      </w:r>
+      <w:proofErr w:type="spellEnd"/>
+      <w:r>
+        <w:rPr>
+          <w:rFonts w:ascii="Times New Roman" w:hAnsi="Times New Roman" w:cs="Times New Roman"/>
+          <w:sz w:val="24"/>
+          <w:szCs w:val="24"/>
+        </w:rPr>
+        <w:t xml:space="preserve"> interactivo que permita integrar, organizar y visualizar la información de los candidatos presidenciales y sus planes de gobierno, facilitando su análisis comparativo mediante herramientas gráficas, filtros dinámicos e indicadores visuales.</w:t>
+      </w:r>
+    </w:p>
+    <w:p>
+      <w:pPr>
+        <w:pBdr>
+          <w:top w:val="nil"/>
+          <w:left w:val="nil"/>
+          <w:bottom w:val="nil"/>
+          <w:right w:val="nil"/>
+          <w:between w:val="nil"/>
+        </w:pBdr>
+        <w:spacing w:after="0" w:line="360" w:lineRule="auto"/>
+        <w:ind w:left="709"/>
+        <w:jc w:val="both"/>
+        <w:rPr>
+          <w:rFonts w:ascii="Times New Roman" w:hAnsi="Times New Roman" w:cs="Times New Roman"/>
+          <w:sz w:val="24"/>
+          <w:szCs w:val="24"/>
+        </w:rPr>
+      </w:pPr>
+    </w:p>
+    <w:p>
+      <w:pPr>
+        <w:pBdr>
+          <w:top w:val="nil"/>
+          <w:left w:val="nil"/>
+          <w:bottom w:val="nil"/>
+          <w:right w:val="nil"/>
+          <w:between w:val="nil"/>
+        </w:pBdr>
+        <w:spacing w:after="0" w:line="360" w:lineRule="auto"/>
+        <w:ind w:left="709"/>
+        <w:jc w:val="both"/>
+        <w:rPr>
+          <w:rFonts w:ascii="Times New Roman" w:hAnsi="Times New Roman" w:cs="Times New Roman"/>
+          <w:sz w:val="24"/>
+          <w:szCs w:val="24"/>
+        </w:rPr>
+      </w:pPr>
+      <w:r>
+        <w:rPr>
+          <w:rFonts w:ascii="Times New Roman" w:hAnsi="Times New Roman" w:cs="Times New Roman"/>
+          <w:sz w:val="24"/>
+          <w:szCs w:val="24"/>
+        </w:rPr>
+        <w:t>De esta manera, el proyecto busca transformar información política compleja y dispersa en una plataforma accesible, clara y útil, contribuyendo a la transparencia informativa y al fortalecimiento de la cultura democrática en el Perú.</w:t>
+      </w:r>
+    </w:p>
+    <w:p>
+      <w:pPr>
+        <w:pBdr>
+          <w:top w:val="nil"/>
+          <w:left w:val="nil"/>
+          <w:bottom w:val="nil"/>
+          <w:right w:val="nil"/>
+          <w:between w:val="nil"/>
+        </w:pBdr>
+        <w:spacing w:after="0" w:line="360" w:lineRule="auto"/>
+        <w:ind w:left="709"/>
+        <w:jc w:val="both"/>
+        <w:rPr>
+          <w:rFonts w:ascii="Times New Roman" w:hAnsi="Times New Roman" w:cs="Times New Roman"/>
           <w:b/>
           <w:bCs/>
           <w:color w:val="000000"/>
@@ -3489,7 +3659,7 @@
       <w:pPr>
         <w:numPr>
           <w:ilvl w:val="1"/>
-          <w:numId w:val="5"/>
+          <w:numId w:val="21"/>
         </w:numPr>
         <w:pBdr>
           <w:top w:val="nil"/>
@@ -3518,7 +3688,6 @@
           <w:sz w:val="24"/>
           <w:szCs w:val="24"/>
         </w:rPr>
-        <w:lastRenderedPageBreak/>
         <w:t>Consideraciones de hardware y software</w:t>
       </w:r>
     </w:p>
@@ -4653,6 +4822,7 @@
                 <w:rFonts w:ascii="Times New Roman" w:hAnsi="Times New Roman" w:cs="Times New Roman"/>
                 <w:noProof/>
               </w:rPr>
+              <w:lastRenderedPageBreak/>
               <w:t xml:space="preserve"> </w:t>
             </w:r>
             <w:r>
@@ -4718,6 +4888,7 @@
                 <w:sz w:val="24"/>
                 <w:szCs w:val="24"/>
               </w:rPr>
+              <w:lastRenderedPageBreak/>
               <w:t>2</w:t>
             </w:r>
           </w:p>
@@ -5004,7 +5175,7 @@
       <w:pPr>
         <w:numPr>
           <w:ilvl w:val="0"/>
-          <w:numId w:val="5"/>
+          <w:numId w:val="21"/>
         </w:numPr>
         <w:pBdr>
           <w:top w:val="nil"/>
@@ -5062,7 +5233,7 @@
       <w:pPr>
         <w:numPr>
           <w:ilvl w:val="1"/>
-          <w:numId w:val="5"/>
+          <w:numId w:val="21"/>
         </w:numPr>
         <w:pBdr>
           <w:top w:val="nil"/>
@@ -5234,7 +5405,6 @@
           <w:sz w:val="24"/>
           <w:szCs w:val="24"/>
         </w:rPr>
-        <w:lastRenderedPageBreak/>
         <w:t xml:space="preserve">Estas tecnologías permiten la recopilación, procesamiento y representación gráfica de grandes volúmenes de información electoral de manera eficiente, facilitando la construcción de </w:t>
       </w:r>
       <w:proofErr w:type="spellStart"/>
@@ -5426,7 +5596,16 @@
           <w:sz w:val="24"/>
           <w:szCs w:val="24"/>
         </w:rPr>
-        <w:t xml:space="preserve">En cuanto al entorno tecnológico, el sistema es viable debido a que las herramientas utilizadas son accesibles, cuentan con documentación amplia y no requieren infraestructura compleja para su implementación. Además, los usuarios finales están familiarizados con el uso de </w:t>
+        <w:t xml:space="preserve">En cuanto al entorno tecnológico, el sistema es viable debido a que las herramientas utilizadas son accesibles, cuentan con documentación amplia y no requieren infraestructura compleja para su implementación. Además, los usuarios finales están </w:t>
+      </w:r>
+      <w:r>
+        <w:rPr>
+          <w:rFonts w:ascii="Times New Roman" w:hAnsi="Times New Roman" w:cs="Times New Roman"/>
+          <w:sz w:val="24"/>
+          <w:szCs w:val="24"/>
+        </w:rPr>
+        <w:lastRenderedPageBreak/>
+        <w:t xml:space="preserve">familiarizados con el uso de </w:t>
       </w:r>
       <w:proofErr w:type="spellStart"/>
       <w:r>
@@ -5519,7 +5698,7 @@
       <w:pPr>
         <w:numPr>
           <w:ilvl w:val="1"/>
-          <w:numId w:val="5"/>
+          <w:numId w:val="21"/>
         </w:numPr>
         <w:pBdr>
           <w:top w:val="nil"/>
@@ -5629,7 +5808,7 @@
       <w:pPr>
         <w:numPr>
           <w:ilvl w:val="2"/>
-          <w:numId w:val="5"/>
+          <w:numId w:val="21"/>
         </w:numPr>
         <w:pBdr>
           <w:top w:val="nil"/>
@@ -5726,7 +5905,6 @@
                 <w:rFonts w:ascii="Times New Roman" w:hAnsi="Times New Roman" w:cs="Times New Roman"/>
                 <w:noProof/>
               </w:rPr>
-              <w:lastRenderedPageBreak/>
               <w:t>COSTOS GENERALES</w:t>
             </w:r>
           </w:p>
@@ -6407,7 +6585,7 @@
       <w:pPr>
         <w:numPr>
           <w:ilvl w:val="2"/>
-          <w:numId w:val="5"/>
+          <w:numId w:val="21"/>
         </w:numPr>
         <w:pBdr>
           <w:top w:val="nil"/>
@@ -7503,7 +7681,7 @@
       <w:pPr>
         <w:numPr>
           <w:ilvl w:val="2"/>
-          <w:numId w:val="5"/>
+          <w:numId w:val="21"/>
         </w:numPr>
         <w:pBdr>
           <w:top w:val="nil"/>
@@ -8345,7 +8523,7 @@
       <w:pPr>
         <w:numPr>
           <w:ilvl w:val="2"/>
-          <w:numId w:val="5"/>
+          <w:numId w:val="21"/>
         </w:numPr>
         <w:pBdr>
           <w:top w:val="nil"/>
@@ -8399,7 +8577,6 @@
           <w:sz w:val="24"/>
           <w:szCs w:val="24"/>
         </w:rPr>
-        <w:lastRenderedPageBreak/>
         <w:fldChar w:fldCharType="begin"/>
       </w:r>
       <w:r>
@@ -9175,7 +9352,7 @@
       <w:pPr>
         <w:numPr>
           <w:ilvl w:val="2"/>
-          <w:numId w:val="5"/>
+          <w:numId w:val="21"/>
         </w:numPr>
         <w:pBdr>
           <w:top w:val="nil"/>
@@ -9739,6 +9916,7 @@
                 <w:bCs/>
                 <w:noProof/>
               </w:rPr>
+              <w:lastRenderedPageBreak/>
               <w:t>TOTAL</w:t>
             </w:r>
           </w:p>
@@ -9837,7 +10015,7 @@
       <w:pPr>
         <w:numPr>
           <w:ilvl w:val="1"/>
-          <w:numId w:val="5"/>
+          <w:numId w:val="21"/>
         </w:numPr>
         <w:pBdr>
           <w:top w:val="nil"/>
@@ -10291,6 +10469,7 @@
           <w:sz w:val="24"/>
           <w:szCs w:val="24"/>
         </w:rPr>
+        <w:lastRenderedPageBreak/>
         <w:t>Finalmente, el desarrollo del sistema será realizado por un equipo de estudiantes con conocimientos en análisis de datos y desarrollo de software, quienes asumirán roles específicos en el diseño, implementación y documentación del proyecto. En conjunto, estos factores demuestran que el proyecto es operativamente viable, ya que puede ser implementado, utilizado y mantenido de manera eficiente en su entorno de aplicación.</w:t>
       </w:r>
     </w:p>
@@ -10336,7 +10515,7 @@
       <w:pPr>
         <w:numPr>
           <w:ilvl w:val="1"/>
-          <w:numId w:val="5"/>
+          <w:numId w:val="21"/>
         </w:numPr>
         <w:pBdr>
           <w:top w:val="nil"/>
@@ -10481,16 +10660,7 @@
           <w:sz w:val="24"/>
           <w:szCs w:val="24"/>
         </w:rPr>
-        <w:t xml:space="preserve"> 29733, Ley de Protección </w:t>
-      </w:r>
-      <w:r>
-        <w:rPr>
-          <w:rFonts w:ascii="Times New Roman" w:hAnsi="Times New Roman" w:cs="Times New Roman"/>
-          <w:sz w:val="24"/>
-          <w:szCs w:val="24"/>
-        </w:rPr>
-        <w:lastRenderedPageBreak/>
-        <w:t>de Datos Personales. En este sentido, el sistema no recopila ni almacena datos sensibles de los usuarios, ya que su función principal es la visualización y análisis de información pública.</w:t>
+        <w:t xml:space="preserve"> 29733, Ley de Protección de Datos Personales. En este sentido, el sistema no recopila ni almacena datos sensibles de los usuarios, ya que su función principal es la visualización y análisis de información pública.</w:t>
       </w:r>
     </w:p>
     <w:p>
@@ -10644,7 +10814,7 @@
       <w:pPr>
         <w:numPr>
           <w:ilvl w:val="1"/>
-          <w:numId w:val="5"/>
+          <w:numId w:val="21"/>
         </w:numPr>
         <w:pBdr>
           <w:top w:val="nil"/>
@@ -10701,7 +10871,17 @@
           <w:sz w:val="24"/>
           <w:szCs w:val="24"/>
         </w:rPr>
-        <w:t>El proyecto presenta una alta viabilidad social, ya que responde a la necesidad de mejorar el acceso a la información electoral de manera clara, organizada y comprensible. En muchos casos, los ciudadanos no cuentan con herramientas que les permitan analizar y comparar de forma sencilla los planes de gobierno y propuestas de los candidatos presidenciales.</w:t>
+        <w:t xml:space="preserve">El proyecto presenta una alta viabilidad social, ya que responde a la necesidad de mejorar el acceso a la información electoral de manera clara, organizada y comprensible. En muchos casos, los ciudadanos no cuentan con herramientas que </w:t>
+      </w:r>
+      <w:r>
+        <w:rPr>
+          <w:rFonts w:ascii="Times New Roman" w:hAnsi="Times New Roman" w:cs="Times New Roman"/>
+          <w:color w:val="000000"/>
+          <w:sz w:val="24"/>
+          <w:szCs w:val="24"/>
+        </w:rPr>
+        <w:lastRenderedPageBreak/>
+        <w:t>les permitan analizar y comparar de forma sencilla los planes de gobierno y propuestas de los candidatos presidenciales.</w:t>
       </w:r>
     </w:p>
     <w:p>
@@ -10868,24 +11048,14 @@
           <w:sz w:val="24"/>
           <w:szCs w:val="24"/>
         </w:rPr>
-        <w:t xml:space="preserve">En este sentido, el sistema no solo beneficia a los usuarios individuales, sino que también aporta al desarrollo de una sociedad más informada y crítica, </w:t>
-      </w:r>
-      <w:r>
-        <w:rPr>
-          <w:rFonts w:ascii="Times New Roman" w:hAnsi="Times New Roman" w:cs="Times New Roman"/>
-          <w:color w:val="000000"/>
-          <w:sz w:val="24"/>
-          <w:szCs w:val="24"/>
-        </w:rPr>
-        <w:lastRenderedPageBreak/>
-        <w:t>fortaleciendo los procesos democráticos. Por lo tanto, el proyecto es socialmente viable.</w:t>
+        <w:t>En este sentido, el sistema no solo beneficia a los usuarios individuales, sino que también aporta al desarrollo de una sociedad más informada y crítica, fortaleciendo los procesos democráticos. Por lo tanto, el proyecto es socialmente viable.</w:t>
       </w:r>
     </w:p>
     <w:p>
       <w:pPr>
         <w:numPr>
           <w:ilvl w:val="1"/>
-          <w:numId w:val="5"/>
+          <w:numId w:val="21"/>
         </w:numPr>
         <w:pBdr>
           <w:top w:val="nil"/>
@@ -11078,6 +11248,7 @@
           <w:sz w:val="24"/>
           <w:szCs w:val="24"/>
         </w:rPr>
+        <w:lastRenderedPageBreak/>
         <w:t>Por otro lado, el proyecto contribuye indirectamente a la educación digital y al uso responsable de la información, promoviendo prácticas sostenibles mediante el aprovechamiento de tecnologías modernas.</w:t>
       </w:r>
     </w:p>
@@ -11153,7 +11324,7 @@
       <w:pPr>
         <w:numPr>
           <w:ilvl w:val="0"/>
-          <w:numId w:val="5"/>
+          <w:numId w:val="21"/>
         </w:numPr>
         <w:pBdr>
           <w:top w:val="nil"/>
@@ -11349,7 +11520,6 @@
           <w:sz w:val="24"/>
           <w:szCs w:val="24"/>
         </w:rPr>
-        <w:lastRenderedPageBreak/>
         <w:t>Si bien el sistema no genera ingresos directos como un producto comercial, produce beneficios económicos indirectos, tales como la optimización del tiempo de análisis, la mejora en la toma de decisiones y el aprovechamiento eficiente de información pública. Además, puede ser utilizado como base para futuros desarrollos tecnológicos o aplicaciones de análisis de datos.</w:t>
       </w:r>
     </w:p>
@@ -11609,6 +11779,7 @@
           <w:sz w:val="24"/>
           <w:szCs w:val="24"/>
         </w:rPr>
+        <w:lastRenderedPageBreak/>
         <w:t>Disminución de esfuerzos repetitivos en la elaboración de reportes</w:t>
       </w:r>
     </w:p>
@@ -11807,7 +11978,6 @@
           <w:sz w:val="24"/>
           <w:szCs w:val="24"/>
         </w:rPr>
-        <w:lastRenderedPageBreak/>
         <w:t>Incremento en la transparencia y comprensión de los procesos electorales</w:t>
       </w:r>
     </w:p>
@@ -12827,6 +12997,7 @@
                 <w:sz w:val="24"/>
                 <w:szCs w:val="24"/>
               </w:rPr>
+              <w:lastRenderedPageBreak/>
               <w:t>3</w:t>
             </w:r>
           </w:p>
@@ -15184,7 +15355,7 @@
       <w:pPr>
         <w:numPr>
           <w:ilvl w:val="0"/>
-          <w:numId w:val="5"/>
+          <w:numId w:val="21"/>
         </w:numPr>
         <w:pBdr>
           <w:top w:val="nil"/>
@@ -15284,7 +15455,6 @@
           <w:sz w:val="24"/>
           <w:szCs w:val="24"/>
         </w:rPr>
-        <w:lastRenderedPageBreak/>
         <w:t xml:space="preserve">En conclusión, el proyecto de </w:t>
       </w:r>
       <w:proofErr w:type="spellStart"/>
@@ -15303,7 +15473,23 @@
           <w:sz w:val="24"/>
           <w:szCs w:val="24"/>
         </w:rPr>
-        <w:t xml:space="preserve"> de análisis electoral y evaluación de planes de gobierno – Perú 2021 es viable desde el punto de vista técnico, ya que se cuenta con herramientas accesibles y ampliamente utilizadas como </w:t>
+        <w:t xml:space="preserve"> de análisis electoral y evaluación de planes de gobierno – Perú 202</w:t>
+      </w:r>
+      <w:r>
+        <w:rPr>
+          <w:rFonts w:ascii="Times New Roman" w:eastAsia="Roboto" w:hAnsi="Times New Roman" w:cs="Times New Roman"/>
+          <w:sz w:val="24"/>
+          <w:szCs w:val="24"/>
+        </w:rPr>
+        <w:t>6</w:t>
+      </w:r>
+      <w:r>
+        <w:rPr>
+          <w:rFonts w:ascii="Times New Roman" w:eastAsia="Roboto" w:hAnsi="Times New Roman" w:cs="Times New Roman"/>
+          <w:sz w:val="24"/>
+          <w:szCs w:val="24"/>
+        </w:rPr>
+        <w:t xml:space="preserve"> es viable desde el punto de vista técnico, ya que se cuenta con herramientas accesibles y ampliamente utilizadas como </w:t>
       </w:r>
       <w:proofErr w:type="spellStart"/>
       <w:r>
@@ -15439,6 +15625,7 @@
           <w:sz w:val="24"/>
           <w:szCs w:val="24"/>
         </w:rPr>
+        <w:lastRenderedPageBreak/>
         <w:t>Desde el punto de vista legal, el proyecto cumple con la normativa vigente en el Perú, especialmente en lo relacionado con el uso de información pública y la protección de datos personales, garantizando un manejo adecuado y transparente de la información.</w:t>
       </w:r>
     </w:p>
@@ -15542,7 +15729,6 @@
           <w:sz w:val="24"/>
           <w:szCs w:val="24"/>
         </w:rPr>
-        <w:lastRenderedPageBreak/>
         <w:t>En conjunto, los resultados obtenidos demuestran que el proyecto es viable desde un enfoque técnico, económico y social, siendo una propuesta recomendable para su desarrollo e implementación en el ámbito académico.</w:t>
       </w:r>
     </w:p>
@@ -15563,6 +15749,7 @@
           <w:iCs/>
           <w:sz w:val="24"/>
           <w:szCs w:val="24"/>
+          <w:u w:val="single"/>
         </w:rPr>
       </w:pPr>
     </w:p>
@@ -16097,6 +16284,119 @@
     </w:lvl>
   </w:abstractNum>
   <w:abstractNum w:abstractNumId="2" w15:restartNumberingAfterBreak="0">
+    <w:nsid w:val="16F72FA3"/>
+    <w:multiLevelType w:val="multilevel"/>
+    <w:tmpl w:val="781E8726"/>
+    <w:lvl w:ilvl="0">
+      <w:start w:val="1"/>
+      <w:numFmt w:val="decimal"/>
+      <w:lvlText w:val="%1"/>
+      <w:lvlJc w:val="left"/>
+      <w:pPr>
+        <w:ind w:left="480" w:hanging="480"/>
+      </w:pPr>
+      <w:rPr>
+        <w:rFonts w:hint="default"/>
+      </w:rPr>
+    </w:lvl>
+    <w:lvl w:ilvl="1">
+      <w:start w:val="4"/>
+      <w:numFmt w:val="decimal"/>
+      <w:lvlText w:val="%1.%2"/>
+      <w:lvlJc w:val="left"/>
+      <w:pPr>
+        <w:ind w:left="862" w:hanging="480"/>
+      </w:pPr>
+      <w:rPr>
+        <w:rFonts w:hint="default"/>
+      </w:rPr>
+    </w:lvl>
+    <w:lvl w:ilvl="2">
+      <w:start w:val="2"/>
+      <w:numFmt w:val="decimal"/>
+      <w:lvlText w:val="%1.%2.%3"/>
+      <w:lvlJc w:val="left"/>
+      <w:pPr>
+        <w:ind w:left="1484" w:hanging="720"/>
+      </w:pPr>
+      <w:rPr>
+        <w:rFonts w:hint="default"/>
+      </w:rPr>
+    </w:lvl>
+    <w:lvl w:ilvl="3">
+      <w:start w:val="1"/>
+      <w:numFmt w:val="decimal"/>
+      <w:lvlText w:val="%1.%2.%3.%4"/>
+      <w:lvlJc w:val="left"/>
+      <w:pPr>
+        <w:ind w:left="1866" w:hanging="720"/>
+      </w:pPr>
+      <w:rPr>
+        <w:rFonts w:hint="default"/>
+      </w:rPr>
+    </w:lvl>
+    <w:lvl w:ilvl="4">
+      <w:start w:val="1"/>
+      <w:numFmt w:val="decimal"/>
+      <w:lvlText w:val="%1.%2.%3.%4.%5"/>
+      <w:lvlJc w:val="left"/>
+      <w:pPr>
+        <w:ind w:left="2608" w:hanging="1080"/>
+      </w:pPr>
+      <w:rPr>
+        <w:rFonts w:hint="default"/>
+      </w:rPr>
+    </w:lvl>
+    <w:lvl w:ilvl="5">
+      <w:start w:val="1"/>
+      <w:numFmt w:val="decimal"/>
+      <w:lvlText w:val="%1.%2.%3.%4.%5.%6"/>
+      <w:lvlJc w:val="left"/>
+      <w:pPr>
+        <w:ind w:left="2990" w:hanging="1080"/>
+      </w:pPr>
+      <w:rPr>
+        <w:rFonts w:hint="default"/>
+      </w:rPr>
+    </w:lvl>
+    <w:lvl w:ilvl="6">
+      <w:start w:val="1"/>
+      <w:numFmt w:val="decimal"/>
+      <w:lvlText w:val="%1.%2.%3.%4.%5.%6.%7"/>
+      <w:lvlJc w:val="left"/>
+      <w:pPr>
+        <w:ind w:left="3732" w:hanging="1440"/>
+      </w:pPr>
+      <w:rPr>
+        <w:rFonts w:hint="default"/>
+      </w:rPr>
+    </w:lvl>
+    <w:lvl w:ilvl="7">
+      <w:start w:val="1"/>
+      <w:numFmt w:val="decimal"/>
+      <w:lvlText w:val="%1.%2.%3.%4.%5.%6.%7.%8"/>
+      <w:lvlJc w:val="left"/>
+      <w:pPr>
+        <w:ind w:left="4114" w:hanging="1440"/>
+      </w:pPr>
+      <w:rPr>
+        <w:rFonts w:hint="default"/>
+      </w:rPr>
+    </w:lvl>
+    <w:lvl w:ilvl="8">
+      <w:start w:val="1"/>
+      <w:numFmt w:val="decimal"/>
+      <w:lvlText w:val="%1.%2.%3.%4.%5.%6.%7.%8.%9"/>
+      <w:lvlJc w:val="left"/>
+      <w:pPr>
+        <w:ind w:left="4856" w:hanging="1800"/>
+      </w:pPr>
+      <w:rPr>
+        <w:rFonts w:hint="default"/>
+      </w:rPr>
+    </w:lvl>
+  </w:abstractNum>
+  <w:abstractNum w:abstractNumId="3" w15:restartNumberingAfterBreak="0">
     <w:nsid w:val="173A485F"/>
     <w:multiLevelType w:val="multilevel"/>
     <w:tmpl w:val="72C20FBE"/>
@@ -16209,7 +16509,7 @@
       </w:rPr>
     </w:lvl>
   </w:abstractNum>
-  <w:abstractNum w:abstractNumId="3" w15:restartNumberingAfterBreak="0">
+  <w:abstractNum w:abstractNumId="4" w15:restartNumberingAfterBreak="0">
     <w:nsid w:val="25C827E2"/>
     <w:multiLevelType w:val="multilevel"/>
     <w:tmpl w:val="72BAEE92"/>
@@ -16322,7 +16622,7 @@
       </w:rPr>
     </w:lvl>
   </w:abstractNum>
-  <w:abstractNum w:abstractNumId="4" w15:restartNumberingAfterBreak="0">
+  <w:abstractNum w:abstractNumId="5" w15:restartNumberingAfterBreak="0">
     <w:nsid w:val="321E5371"/>
     <w:multiLevelType w:val="multilevel"/>
     <w:tmpl w:val="C47A371C"/>
@@ -16435,7 +16735,7 @@
       </w:rPr>
     </w:lvl>
   </w:abstractNum>
-  <w:abstractNum w:abstractNumId="5" w15:restartNumberingAfterBreak="0">
+  <w:abstractNum w:abstractNumId="6" w15:restartNumberingAfterBreak="0">
     <w:nsid w:val="35720EB3"/>
     <w:multiLevelType w:val="multilevel"/>
     <w:tmpl w:val="5C5C8B52"/>
@@ -16548,7 +16848,7 @@
       </w:rPr>
     </w:lvl>
   </w:abstractNum>
-  <w:abstractNum w:abstractNumId="6" w15:restartNumberingAfterBreak="0">
+  <w:abstractNum w:abstractNumId="7" w15:restartNumberingAfterBreak="0">
     <w:nsid w:val="39BC1F66"/>
     <w:multiLevelType w:val="multilevel"/>
     <w:tmpl w:val="85A484EC"/>
@@ -16634,7 +16934,7 @@
       </w:pPr>
     </w:lvl>
   </w:abstractNum>
-  <w:abstractNum w:abstractNumId="7" w15:restartNumberingAfterBreak="0">
+  <w:abstractNum w:abstractNumId="8" w15:restartNumberingAfterBreak="0">
     <w:nsid w:val="426B40E2"/>
     <w:multiLevelType w:val="hybridMultilevel"/>
     <w:tmpl w:val="C10A4A4C"/>
@@ -16747,7 +17047,7 @@
       </w:rPr>
     </w:lvl>
   </w:abstractNum>
-  <w:abstractNum w:abstractNumId="8" w15:restartNumberingAfterBreak="0">
+  <w:abstractNum w:abstractNumId="9" w15:restartNumberingAfterBreak="0">
     <w:nsid w:val="56902D3D"/>
     <w:multiLevelType w:val="hybridMultilevel"/>
     <w:tmpl w:val="4F84DC3C"/>
@@ -16860,7 +17160,7 @@
       </w:rPr>
     </w:lvl>
   </w:abstractNum>
-  <w:abstractNum w:abstractNumId="9" w15:restartNumberingAfterBreak="0">
+  <w:abstractNum w:abstractNumId="10" w15:restartNumberingAfterBreak="0">
     <w:nsid w:val="58144C45"/>
     <w:multiLevelType w:val="hybridMultilevel"/>
     <w:tmpl w:val="67A8283E"/>
@@ -16973,7 +17273,7 @@
       </w:rPr>
     </w:lvl>
   </w:abstractNum>
-  <w:abstractNum w:abstractNumId="10" w15:restartNumberingAfterBreak="0">
+  <w:abstractNum w:abstractNumId="11" w15:restartNumberingAfterBreak="0">
     <w:nsid w:val="5B2C6148"/>
     <w:multiLevelType w:val="multilevel"/>
     <w:tmpl w:val="A06026E0"/>
@@ -17086,7 +17386,7 @@
       </w:rPr>
     </w:lvl>
   </w:abstractNum>
-  <w:abstractNum w:abstractNumId="11" w15:restartNumberingAfterBreak="0">
+  <w:abstractNum w:abstractNumId="12" w15:restartNumberingAfterBreak="0">
     <w:nsid w:val="5FE35004"/>
     <w:multiLevelType w:val="hybridMultilevel"/>
     <w:tmpl w:val="DB249368"/>
@@ -17199,7 +17499,7 @@
       </w:rPr>
     </w:lvl>
   </w:abstractNum>
-  <w:abstractNum w:abstractNumId="12" w15:restartNumberingAfterBreak="0">
+  <w:abstractNum w:abstractNumId="13" w15:restartNumberingAfterBreak="0">
     <w:nsid w:val="62117D7C"/>
     <w:multiLevelType w:val="multilevel"/>
     <w:tmpl w:val="C57A59E8"/>
@@ -17285,7 +17585,7 @@
       </w:pPr>
     </w:lvl>
   </w:abstractNum>
-  <w:abstractNum w:abstractNumId="13" w15:restartNumberingAfterBreak="0">
+  <w:abstractNum w:abstractNumId="14" w15:restartNumberingAfterBreak="0">
     <w:nsid w:val="659314D3"/>
     <w:multiLevelType w:val="multilevel"/>
     <w:tmpl w:val="4E8E13CE"/>
@@ -17371,7 +17671,7 @@
       </w:pPr>
     </w:lvl>
   </w:abstractNum>
-  <w:abstractNum w:abstractNumId="14" w15:restartNumberingAfterBreak="0">
+  <w:abstractNum w:abstractNumId="15" w15:restartNumberingAfterBreak="0">
     <w:nsid w:val="65F712ED"/>
     <w:multiLevelType w:val="multilevel"/>
     <w:tmpl w:val="A87C2C8E"/>
@@ -17484,7 +17784,7 @@
       </w:rPr>
     </w:lvl>
   </w:abstractNum>
-  <w:abstractNum w:abstractNumId="15" w15:restartNumberingAfterBreak="0">
+  <w:abstractNum w:abstractNumId="16" w15:restartNumberingAfterBreak="0">
     <w:nsid w:val="677F4A5C"/>
     <w:multiLevelType w:val="hybridMultilevel"/>
     <w:tmpl w:val="D812EBF2"/>
@@ -17597,7 +17897,7 @@
       </w:rPr>
     </w:lvl>
   </w:abstractNum>
-  <w:abstractNum w:abstractNumId="16" w15:restartNumberingAfterBreak="0">
+  <w:abstractNum w:abstractNumId="17" w15:restartNumberingAfterBreak="0">
     <w:nsid w:val="6ABD2872"/>
     <w:multiLevelType w:val="multilevel"/>
     <w:tmpl w:val="99FA9EA0"/>
@@ -17710,7 +18010,7 @@
       </w:rPr>
     </w:lvl>
   </w:abstractNum>
-  <w:abstractNum w:abstractNumId="17" w15:restartNumberingAfterBreak="0">
+  <w:abstractNum w:abstractNumId="18" w15:restartNumberingAfterBreak="0">
     <w:nsid w:val="6B0A1A5F"/>
     <w:multiLevelType w:val="hybridMultilevel"/>
     <w:tmpl w:val="EED4D800"/>
@@ -17823,7 +18123,7 @@
       </w:rPr>
     </w:lvl>
   </w:abstractNum>
-  <w:abstractNum w:abstractNumId="18" w15:restartNumberingAfterBreak="0">
+  <w:abstractNum w:abstractNumId="19" w15:restartNumberingAfterBreak="0">
     <w:nsid w:val="7EB41BFD"/>
     <w:multiLevelType w:val="multilevel"/>
     <w:tmpl w:val="C3A416AE"/>
@@ -17936,7 +18236,7 @@
       </w:rPr>
     </w:lvl>
   </w:abstractNum>
-  <w:abstractNum w:abstractNumId="19" w15:restartNumberingAfterBreak="0">
+  <w:abstractNum w:abstractNumId="20" w15:restartNumberingAfterBreak="0">
     <w:nsid w:val="7F472984"/>
     <w:multiLevelType w:val="hybridMultilevel"/>
     <w:tmpl w:val="B026176E"/>
@@ -18050,19 +18350,19 @@
     </w:lvl>
   </w:abstractNum>
   <w:num w:numId="1">
-    <w:abstractNumId w:val="3"/>
+    <w:abstractNumId w:val="4"/>
   </w:num>
   <w:num w:numId="2">
-    <w:abstractNumId w:val="18"/>
+    <w:abstractNumId w:val="19"/>
   </w:num>
   <w:num w:numId="3">
-    <w:abstractNumId w:val="4"/>
+    <w:abstractNumId w:val="5"/>
   </w:num>
   <w:num w:numId="4">
-    <w:abstractNumId w:val="10"/>
+    <w:abstractNumId w:val="11"/>
   </w:num>
   <w:num w:numId="5">
-    <w:abstractNumId w:val="13"/>
+    <w:abstractNumId w:val="14"/>
   </w:num>
   <w:num w:numId="6">
     <w:abstractNumId w:val="0"/>
@@ -18071,43 +18371,46 @@
     <w:abstractNumId w:val="1"/>
   </w:num>
   <w:num w:numId="8">
-    <w:abstractNumId w:val="5"/>
+    <w:abstractNumId w:val="6"/>
   </w:num>
   <w:num w:numId="9">
-    <w:abstractNumId w:val="2"/>
+    <w:abstractNumId w:val="3"/>
   </w:num>
   <w:num w:numId="10">
-    <w:abstractNumId w:val="6"/>
+    <w:abstractNumId w:val="7"/>
   </w:num>
   <w:num w:numId="11">
+    <w:abstractNumId w:val="13"/>
+  </w:num>
+  <w:num w:numId="12">
+    <w:abstractNumId w:val="18"/>
+  </w:num>
+  <w:num w:numId="13">
+    <w:abstractNumId w:val="15"/>
+  </w:num>
+  <w:num w:numId="14">
+    <w:abstractNumId w:val="17"/>
+  </w:num>
+  <w:num w:numId="15">
     <w:abstractNumId w:val="12"/>
   </w:num>
-  <w:num w:numId="12">
-    <w:abstractNumId w:val="17"/>
+  <w:num w:numId="16">
+    <w:abstractNumId w:val="20"/>
   </w:num>
-  <w:num w:numId="13">
-    <w:abstractNumId w:val="14"/>
+  <w:num w:numId="17">
+    <w:abstractNumId w:val="9"/>
   </w:num>
-  <w:num w:numId="14">
+  <w:num w:numId="18">
+    <w:abstractNumId w:val="8"/>
+  </w:num>
+  <w:num w:numId="19">
+    <w:abstractNumId w:val="10"/>
+  </w:num>
+  <w:num w:numId="20">
     <w:abstractNumId w:val="16"/>
   </w:num>
-  <w:num w:numId="15">
-    <w:abstractNumId w:val="11"/>
-  </w:num>
-  <w:num w:numId="16">
-    <w:abstractNumId w:val="19"/>
-  </w:num>
-  <w:num w:numId="17">
-    <w:abstractNumId w:val="8"/>
-  </w:num>
-  <w:num w:numId="18">
-    <w:abstractNumId w:val="7"/>
-  </w:num>
-  <w:num w:numId="19">
-    <w:abstractNumId w:val="9"/>
-  </w:num>
-  <w:num w:numId="20">
-    <w:abstractNumId w:val="15"/>
+  <w:num w:numId="21">
+    <w:abstractNumId w:val="2"/>
   </w:num>
 </w:numbering>
 </file>

</xml_diff>